<commit_message>
Scopus/Q1 rigour uplift: Monte Carlo FIRR, CoE break-even, expanded refs, FRL DOCX, changelog: paper/P1_manuscript_FRL.docx
</commit_message>
<xml_diff>
--- a/paper/P1_manuscript_FRL.docx
+++ b/paper/P1_manuscript_FRL.docx
@@ -35,7 +35,7 @@
     </w:p>
     <w:p>
       <w:pPr>
-        <w:spacing w:after="30"/>
+        <w:spacing w:after="20"/>
       </w:pPr>
       <w:r>
         <w:rPr>
@@ -43,12 +43,12 @@
           <w:sz w:val="22"/>
           <w:szCs w:val="22"/>
         </w:rPr>
-        <w:t xml:space="preserve">Sandeep S</w:t>
-      </w:r>
-    </w:p>
-    <w:p>
-      <w:pPr>
-        <w:spacing w:after="30"/>
+        <w:t xml:space="preserve">Sandeep S.</w:t>
+      </w:r>
+    </w:p>
+    <w:p>
+      <w:pPr>
+        <w:spacing w:after="20"/>
       </w:pPr>
       <w:r>
         <w:rPr>
@@ -58,22 +58,36 @@
           <w:sz w:val="18"/>
           <w:szCs w:val="18"/>
         </w:rPr>
-        <w:t xml:space="preserve">University of Mysore (PhD Research Scholar); WorldQuant University (MScFE).</w:t>
-      </w:r>
-    </w:p>
-    <w:p>
-      <w:pPr>
-        <w:spacing w:after="160"/>
-      </w:pPr>
-      <w:r>
-        <w:rPr>
-          <w:rFonts w:ascii="Times New Roman" w:cs="Times New Roman" w:eastAsia="Times New Roman" w:hAnsi="Times New Roman"/>
+        <w:t xml:space="preserve">PhD Research Scholar, University of Mysore, Mysuru, Karnataka, India; MScFE, WorldQuant University.</w:t>
+      </w:r>
+    </w:p>
+    <w:p>
+      <w:pPr>
+        <w:spacing w:after="20"/>
+      </w:pPr>
+      <w:r>
+        <w:rPr>
+          <w:rFonts w:ascii="Times New Roman" w:cs="Times New Roman" w:eastAsia="Times New Roman" w:hAnsi="Times New Roman"/>
+          <w:color w:val="555555"/>
           <w:sz w:val="18"/>
           <w:szCs w:val="18"/>
         </w:rPr>
+        <w:t xml:space="preserve">ORCID: [to be inserted] · Corresponding author: [email to be inserted]</w:t>
+      </w:r>
+    </w:p>
+    <w:p>
+      <w:pPr>
+        <w:spacing w:after="160"/>
+      </w:pPr>
+      <w:r>
+        <w:rPr>
+          <w:rFonts w:ascii="Times New Roman" w:cs="Times New Roman" w:eastAsia="Times New Roman" w:hAnsi="Times New Roman"/>
+          <w:sz w:val="18"/>
+          <w:szCs w:val="18"/>
+        </w:rPr>
         <w:t xml:space="preserve">Repository: </w:t>
       </w:r>
-      <w:hyperlink w:history="1" r:id="rIdg1qd9f7b6prvf3t78qhue">
+      <w:hyperlink w:history="1" r:id="rIdh1ixjkt5vofuhatulmwe3">
         <w:r>
           <w:rPr>
             <w:rFonts w:ascii="Times New Roman" w:cs="Times New Roman" w:eastAsia="Times New Roman" w:hAnsi="Times New Roman"/>
@@ -88,6 +102,34 @@
     </w:p>
     <w:p>
       <w:pPr>
+        <w:spacing w:after="160"/>
+      </w:pPr>
+      <w:r>
+        <w:rPr>
+          <w:rFonts w:ascii="Times New Roman" w:cs="Times New Roman" w:eastAsia="Times New Roman" w:hAnsi="Times New Roman"/>
+          <w:b/>
+          <w:bCs/>
+          <w:i/>
+          <w:iCs/>
+          <w:sz w:val="17"/>
+          <w:szCs w:val="17"/>
+        </w:rPr>
+        <w:t xml:space="preserve">Declarations. </w:t>
+      </w:r>
+      <w:r>
+        <w:rPr>
+          <w:rFonts w:ascii="Times New Roman" w:cs="Times New Roman" w:eastAsia="Times New Roman" w:hAnsi="Times New Roman"/>
+          <w:i/>
+          <w:iCs/>
+          <w:color w:val="555555"/>
+          <w:sz w:val="17"/>
+          <w:szCs w:val="17"/>
+        </w:rPr>
+        <w:t xml:space="preserve">Funding: none. Conflicts of interest: none declared. Data availability: all raw inputs, processed datasets, notebooks, and figures are openly archived in the public GitHub repository (see Section 10). Reproducibility: every quantitative claim traces to a committed source or a logged retrieval; all figures and tables are regenerated by committed scripts, with the Monte Carlo simulation seeded at 53326 (the ADB project number) for exact reproducibility.</w:t>
+      </w:r>
+    </w:p>
+    <w:p>
+      <w:pPr>
         <w:spacing w:after="60" w:before="80"/>
       </w:pPr>
       <w:r>
@@ -116,7 +158,7 @@
           <w:sz w:val="19"/>
           <w:szCs w:val="19"/>
         </w:rPr>
-        <w:t xml:space="preserve">ADB’s own analysis puts Bengaluru Metro Phase 2A/2B FIRR at 1.921% versus a 2.629% WACC.</w:t>
+        <w:t xml:space="preserve">ADB’s analysis puts Bengaluru Metro Phase 2A/2B FIRR at 1.921% versus a 2.629% real WACC — a −0.708 pp viability gap.</w:t>
       </w:r>
     </w:p>
     <w:p>
@@ -134,7 +176,7 @@
           <w:sz w:val="19"/>
           <w:szCs w:val="19"/>
         </w:rPr>
-        <w:t xml:space="preserve">We reproduce that WACC from disclosed components to within a rounding error (2.6288%).</w:t>
+        <w:t xml:space="preserve">We reproduce that WACC from disclosed components to four significant figures (2.6288%).</w:t>
       </w:r>
     </w:p>
     <w:p>
@@ -152,7 +194,7 @@
           <w:sz w:val="19"/>
           <w:szCs w:val="19"/>
         </w:rPr>
-        <w:t xml:space="preserve">A credible “+10% ridership, −10% cost” tokenization scenario lifts FIRR only to ~2.35% — still below WACC.</w:t>
+        <w:t xml:space="preserve">A 20,000-draw Monte Carlo simulation puts the probability of clearing WACC at only 10.9%.</w:t>
       </w:r>
     </w:p>
     <w:p>
@@ -170,7 +212,7 @@
           <w:sz w:val="19"/>
           <w:szCs w:val="19"/>
         </w:rPr>
-        <w:t xml:space="preserve">Tokenization is a subsidy-reducing lever, not a route to unsubsidized viability, on these numbers.</w:t>
+        <w:t xml:space="preserve">A Spearman tornado attributes FIRR variance chiefly to ridership (20.7%), trip length (17.5%), and capital cost (16.5%).</w:t>
       </w:r>
     </w:p>
     <w:p>
@@ -188,7 +230,7 @@
           <w:sz w:val="19"/>
           <w:szCs w:val="19"/>
         </w:rPr>
-        <w:t xml:space="preserve">SEBI’s 2025 ₹25-lakh minimum is the regulatory precondition for a retail-accessible T-InvIT.</w:t>
+        <w:t xml:space="preserve">Tokenization’s genuine lever — a lower cost of equity — must fall ~130 bp to close the gap.</w:t>
       </w:r>
     </w:p>
     <w:p>
@@ -217,7 +259,7 @@
           <w:sz w:val="19"/>
           <w:szCs w:val="19"/>
         </w:rPr>
-        <w:t xml:space="preserve">Urban infrastructure in India is caught in a familiar bind: the projects with the largest social returns struggle to clear a private cost-of-capital hurdle. The Asian Development Bank’s financial analysis of the Bengaluru Metro Rail Project (Phase 2A/2B) puts the project’s post-tax financial internal rate of return (FIRR) at 1.921% against a real weighted-average cost of capital (WACC) of 2.629% — a viability gap of −0.708 percentage points closed only by sovereign concessional debt and equity subsidy. We reproduce ADB’s WACC from its disclosed JICA/ADB/equity weights and costs to within a rounding error (2.6288% versus 2.629%). We then ask whether a tokenized infrastructure investment trust (a “T-InvIT”) could narrow this gap. Using ADB’s published ridership anchors for FY2025 and FY2031 and its stated 4.11% post-2031 growth, we build a transparent ridership-and-revenue forecast and a sensitivity surface around the base FIRR. A combined “+10% ridership, −10% cost” scenario lifts the indicative FIRR to about 2.35% — materially better, but still short of the 2.629% WACC. Tokenization is a financing-access and cost-of-equity lever, not a magic wand: it plausibly compresses the gap but does not, on these numbers, eliminate it. We connect this to SEBI’s September 2025 reform cutting the InvIT minimum investment to ₹25 lakh, and to the ₹27,000 crore Peripheral Ring Road as a second candidate asset whose ~₹21,000 crore land-acquisition burden is the dominant cost driver.</w:t>
+        <w:t xml:space="preserve">Urban infrastructure in India is caught in a familiar bind: the projects with the largest social returns — metro lines, ring roads — are precisely the ones that struggle to clear a private cost-of-capital hurdle. The Asian Development Bank’s financial analysis of the Bengaluru Metro Rail Project (Phase 2A/2B) puts the project’s post-tax financial internal rate of return (FIRR) at 1.921% against a real weighted-average cost of capital (WACC) of 2.629% — a viability gap of −0.708 percentage points that only sovereign concessional debt and equity subsidy close. We reproduce ADB’s WACC from its disclosed JICA/ADB/equity weights and costs to within a rounding error (2.6288% versus a reported 2.629%), establishing that the published gap is internally consistent and not an extraction artefact. We then ask a forward-looking but disciplined question: could a tokenized infrastructure investment trust (a “T-InvIT”) realistically narrow this gap, and what would have to be true for it to do so? Using ADB’s published ridership anchors for FY2025 (157,594 passengers/day) and FY2031 (600,651/day) and its stated 4.11% post-2031 growth, we build a transparent discounted-cash-flow FIRR model and propagate uncertainty through a 20,000-draw Monte Carlo simulation over seven calibrated assumption ranges. The simulated FIRR has a mean of 1.60% (90% interval 0.22%–2.96%), and the probability that the project clears its 2.629% real WACC is only 10.9%. A Spearman tornado attributes the FIRR’s variance principally to the ridership multiplier (20.7%), average trip length (17.5%), and capital cost (16.5%). To isolate tokenization’s actual lever — a lower cost of equity — we sweep the equity cost downward and find the viability gap closes only at roughly a 130-basis-point reduction in the cost of equity, given equity’s 55.66% weight in the capital stack. The honest conclusion is that tokenization is a cost-of-capital and subsidy-reduction instrument, not a route to unsubsidized viability, on these numbers; the Peripheral Ring Road, whose cost base is dominated by market-priced land acquisition, is the more promising application.</w:t>
       </w:r>
     </w:p>
     <w:p>
@@ -255,7 +297,7 @@
           <w:sz w:val="19"/>
           <w:szCs w:val="19"/>
         </w:rPr>
-        <w:t xml:space="preserve">JEL: </w:t>
+        <w:t xml:space="preserve">JEL classification: </w:t>
       </w:r>
       <w:r>
         <w:rPr>
@@ -263,7 +305,7 @@
           <w:sz w:val="19"/>
           <w:szCs w:val="19"/>
         </w:rPr>
-        <w:t xml:space="preserve">G23; G18; H54; R42</w:t>
+        <w:t xml:space="preserve">G23; G28; H54; R42</w:t>
       </w:r>
     </w:p>
     <w:p>
@@ -293,7 +335,7 @@
           <w:sz w:val="21"/>
           <w:szCs w:val="21"/>
         </w:rPr>
-        <w:t xml:space="preserve">Every few years a new financing technology is offered as the answer to India’s urban-infrastructure funding shortfall, and tokenization is the current candidate. The pitch is seductive: fractionalize the equity in a metro line or a ring road, put it on a distributed ledger, and a deep pool of retail and global capital will price the asset more efficiently and demand a lower return. Whether that pitch survives contact with an actual project’s economics is an empirical question, and this paper answers it for two concrete Bengaluru assets.</w:t>
+        <w:t xml:space="preserve">Every few years a new financing technology is offered as the answer to India’s urban-infrastructure funding shortfall, and tokenization is the current candidate. The pitch is seductive: fractionalize the equity in a metro line or a ring road, record it on a distributed ledger, and a deep pool of retail and global capital will price the asset more efficiently and demand a lower return. Whether that pitch survives contact with an actual project’s economics is an empirical question, and this paper answers it for two concrete Bengaluru assets rather than in the abstract.</w:t>
       </w:r>
     </w:p>
     <w:p>
@@ -307,7 +349,7 @@
           <w:sz w:val="21"/>
           <w:szCs w:val="21"/>
         </w:rPr>
-        <w:t xml:space="preserve">The starting point is a number that should give any tokenization enthusiast pause. ADB’s financial analysis of Bengaluru Metro Phase 2A/2B reports a project post-tax FIRR of 1.921% against a real WACC of 2.629% (Asian Development Bank, 2020). A project whose return sits below its cost of capital does not get built by the private sector; it gets built because sovereign and multilateral lenders supply capital at concessional rates. ADB itself estimates BMRCL needs roughly ₹83.6 billion of sponsor support across FY2021–FY2033 to keep its debt-service-coverage ratio at 1.0.</w:t>
+        <w:t xml:space="preserve">The starting point is a number that should give any tokenization enthusiast pause. ADB’s financial analysis of Bengaluru Metro Phase 2A/2B reports a project post-tax FIRR of 1.921% against a real WACC of 2.629% (Asian Development Bank, 2020; figures extracted and logged in data/raw/JICA_loans/ADB/ADB_FA_download_status.md). A project whose return sits below its cost of capital is not built by the private sector; it is built because sovereign and multilateral lenders supply capital at concessional rates and governments inject equity that does not demand a market return. ADB itself estimates that BMRCL needs roughly ₹83.6 billion of sponsor support across FY2021–FY2033 to keep its debt-service-coverage ratio at 1.0.</w:t>
       </w:r>
     </w:p>
     <w:p>
@@ -321,7 +363,7 @@
           <w:sz w:val="21"/>
           <w:szCs w:val="21"/>
         </w:rPr>
-        <w:t xml:space="preserve">The relevant question for tokenization is therefore not “can it make this project profitable?” — nothing short of a structural change in ridership or cost does that — but “can it lower the blended cost of capital enough to shrink the subsidy bill, and by how much?”</w:t>
+        <w:t xml:space="preserve">So the relevant question for tokenization is not “can it make this project profitable?” — on these economics, nothing short of a structural change in ridership or cost does that — but rather “can it lower the blended cost of capital enough to shrink the subsidy bill, and by how much?” That is the question we take seriously.</w:t>
       </w:r>
     </w:p>
     <w:p>
@@ -335,7 +377,7 @@
           <w:sz w:val="21"/>
           <w:szCs w:val="21"/>
         </w:rPr>
-        <w:t xml:space="preserve">We make three contributions. First, we independently reproduce ADB’s WACC from its disclosed components, confirming the viability gap is real and consistent. Second, we build a transparent, reproducible ridership and revenue forecast anchored entirely on ADB’s published figures, plus a sensitivity analysis showing how far plausible tokenization-driven improvements move the FIRR. Third, we set out a concrete T-InvIT design for the metro and the Peripheral Ring Road, grounded in the regulatory reality created by SEBI’s September 2025 InvIT amendment.</w:t>
+        <w:t xml:space="preserve">We make three contributions. (1) We independently reproduce ADB’s real WACC from its disclosed component weights and costs to four significant figures (2.6288% versus a reported 2.629%), confirming the −0.708-percentage-point viability gap is internally consistent rather than an extraction artefact. (2) We build a transparent discounted-cash-flow FIRR model anchored entirely on ADB’s published figures and propagate uncertainty through a 20,000-draw Monte Carlo simulation, reporting the full FIRR distribution, the probability of clearing WACC (10.9%), a Spearman-correlation tornado of variance drivers, and a cost-of-equity break-even sweep that pinpoints how large a tokenization-driven equity-cost reduction (~130 bp) would have to be to close the gap — replacing the crude elasticity heuristic of earlier drafts with an explicit, reproducible cash-flow model. (3) We set out a concrete, SEBI-compliance-feasible T-InvIT design for two Bengaluru assets — the metro and the Peripheral Ring Road — grounded in the regulatory reality created by SEBI’s September 2025 InvIT amendment, and we are explicit about what tokenization can and cannot achieve, including the honest caveat that no tokenized InvIT yet exists in India and that the practitioner survey arm of this project has not been fielded.</w:t>
       </w:r>
     </w:p>
     <w:p>
@@ -351,7 +393,7 @@
           <w:sz w:val="26"/>
           <w:szCs w:val="26"/>
         </w:rPr>
-        <w:t xml:space="preserve">2. Institutional background</w:t>
+        <w:t xml:space="preserve">2. Literature and Institutional Background</w:t>
       </w:r>
     </w:p>
     <w:p>
@@ -369,7 +411,7 @@
           <w:sz w:val="22"/>
           <w:szCs w:val="22"/>
         </w:rPr>
-        <w:t xml:space="preserve">2.1. The two assets</w:t>
+        <w:t xml:space="preserve">2.1. Tokenization and infrastructure finance</w:t>
       </w:r>
     </w:p>
     <w:p>
@@ -383,21 +425,7 @@
           <w:sz w:val="21"/>
           <w:szCs w:val="21"/>
         </w:rPr>
-        <w:t xml:space="preserve">Namma Metro Phase 2A/2B is the analytical core because it comes with a published, auditable financial model: total project cost ₹139,088.8 million at April-2020 prices, funded by JICA loan (17.24% of WACC weight), ADB loan (27.10%), and equity (55.66%). A subsequent JICA ODA loan for Phase 3, signed 24 March 2026, adds ¥102,480 million at TORF + 80 basis points over a 30-year tenor with a 10-year grace period (JICA, 2026). These long-dated, low-coupon, sovereign-backed liabilities are precisely why the metro’s blended cost of capital is low.</w:t>
-      </w:r>
-    </w:p>
-    <w:p>
-      <w:pPr>
-        <w:spacing w:after="140" w:line="276"/>
-        <w:jc w:val="both"/>
-      </w:pPr>
-      <w:r>
-        <w:rPr>
-          <w:rFonts w:ascii="Times New Roman" w:cs="Times New Roman" w:eastAsia="Times New Roman" w:hAnsi="Times New Roman"/>
-          <w:sz w:val="21"/>
-          <w:szCs w:val="21"/>
-        </w:rPr>
-        <w:t xml:space="preserve">The Peripheral Ring Road / Bengaluru Business Corridor (BBC) is the second candidate. The most current public figures put the total project at about ₹27,000 crore, of which land acquisition alone is roughly ₹21,000 crore, with Package 1 awarded to SNC at an estimated ₹3,348 crore (Moneycontrol, 2026). We were unable to locate a completed primary DPR or Government Order — a February-2024 BDA tender to prepare the PRR-2 DPR confirms the southern stretch was still being scoped — so PRR figures are drawn from current bid results and government statements, with that limitation flagged.</w:t>
+        <w:t xml:space="preserve">The academic and policy literature on real-asset tokenization frames distributed-ledger fractionalization primarily as a liquidity and access innovation: smaller ticket sizes, broader investor participation, and lower intermediation cost (cf. the InvIT/REIT liquidity evidence developed in the companion empirical study, Sandeep, 2025). The InvIT vehicle itself was introduced in India by SEBI to channel retail and institutional capital into illiquid, long-duration assets; tokenization is best read as an incremental overlay on that structure rather than a replacement for it. This paper contributes a project-level viability test that is largely absent from the promotional literature.</w:t>
       </w:r>
     </w:p>
     <w:p>
@@ -415,7 +443,7 @@
           <w:sz w:val="22"/>
           <w:szCs w:val="22"/>
         </w:rPr>
-        <w:t xml:space="preserve">2.2. The regulatory enabler</w:t>
+        <w:t xml:space="preserve">2.2. The two assets</w:t>
       </w:r>
     </w:p>
     <w:p>
@@ -429,23 +457,7 @@
           <w:sz w:val="21"/>
           <w:szCs w:val="21"/>
         </w:rPr>
-        <w:t xml:space="preserve">A tokenized InvIT presupposes that infrastructure units can be held by a broad investor base. Until late 2025 that was effectively blocked for privately placed structures by a ₹1 crore minimum subscription. SEBI’s InvIT (Third Amendment) Regulations, 2025, gazetted 2 September 2025, cut that minimum to ₹25 lakh and removed the ₹25 crore proviso (SEBI, 2025). This is the single most important regulatory precondition for a retail-accessible T-InvIT.</w:t>
-      </w:r>
-    </w:p>
-    <w:p>
-      <w:pPr>
-        <w:spacing w:after="120" w:before="280"/>
-      </w:pPr>
-      <w:r>
-        <w:rPr>
-          <w:rFonts w:ascii="Times New Roman" w:cs="Times New Roman" w:eastAsia="Times New Roman" w:hAnsi="Times New Roman"/>
-          <w:b/>
-          <w:bCs/>
-          <w:color w:val="1F3864"/>
-          <w:sz w:val="26"/>
-          <w:szCs w:val="26"/>
-        </w:rPr>
-        <w:t xml:space="preserve">3. Data and provenance</w:t>
+        <w:t xml:space="preserve">Namma Metro Phase 2A/2B. The ADB-financed extensions are the analytical core of the paper because they come with a published, auditable financial model. Total project cost is ₹139,088.8 million at April-2020 prices, funded by a blend of JICA loan (17.24% of WACC weight), ADB loan (27.10%), and equity (55.66%). A subsequent JICA Official Development Assistance loan for Phase 3, signed 24 March 2026, adds ¥102,480 million at TORF + 80 basis points over a 30-year tenor with a 10-year grace period (JICA, 2026; terms in data/raw/JICA_loans/). These are precisely the long-dated, low-coupon, sovereign-backed liabilities that make the metro’s blended cost of capital low in the first place.</w:t>
       </w:r>
     </w:p>
     <w:p>
@@ -459,23 +471,7 @@
           <w:sz w:val="21"/>
           <w:szCs w:val="21"/>
         </w:rPr>
-        <w:t xml:space="preserve">Every figure traces to a committed source or a logged retrieval. The metro economics come from the ADB Financial Analysis (ADB Project 53326-001). ADB’s server returns HTTP 403 to automated download, so the canonical URL and the full extracted figure set are logged in data/raw/JICA_loans/ADB/ADB_FA_download_status.md rather than redistributed as a PDF. JICA Phase-3 loan terms come from JICA’s Ex-Ante Evaluation PDF, committed in full. PRR/BBC cost figures come from committed news and tender HTML. The SEBI amendment text is committed in the companion repository. BMRCL’s own FY2023-24 statutory filing is committed, but we note candidly that the document BMRCL publishes under “Annual Report 2023-24” is its Right-to-Information Act §25 yearly return — request-disposal statistics, not financial statements — so it supplies provenance but no usable financial data. The full register is in DATA_SOURCES.md.</w:t>
-      </w:r>
-    </w:p>
-    <w:p>
-      <w:pPr>
-        <w:spacing w:after="120" w:before="280"/>
-      </w:pPr>
-      <w:r>
-        <w:rPr>
-          <w:rFonts w:ascii="Times New Roman" w:cs="Times New Roman" w:eastAsia="Times New Roman" w:hAnsi="Times New Roman"/>
-          <w:b/>
-          <w:bCs/>
-          <w:color w:val="1F3864"/>
-          <w:sz w:val="26"/>
-          <w:szCs w:val="26"/>
-        </w:rPr>
-        <w:t xml:space="preserve">4. Method</w:t>
+        <w:t xml:space="preserve">Peripheral Ring Road / Bengaluru Business Corridor (BBC). The second candidate is the long-delayed ~73 km ring road, now rebranded the Bengaluru Business Corridor. The most current public cost figures put the total project at about ₹27,000 crore, of which land acquisition alone is roughly ₹21,000 crore, with the first construction package (Package 1) awarded to SNC at an estimated ₹3,348 crore (Moneycontrol, 2026; data/raw/PRR_BBC/). Land acquisition for 948 acres, with an enhanced compensation policy, is the binding constraint. We were unable to locate a completed primary DPR or Government Order — a February-2024 BDA tender to prepare the PRR-2 DPR confirms the southern stretch was still being scoped (search log in PRR_source_status.md) — so PRR figures here are drawn from current bid results and government statements, with that limitation flagged.</w:t>
       </w:r>
     </w:p>
     <w:p>
@@ -493,7 +489,7 @@
           <w:sz w:val="22"/>
           <w:szCs w:val="22"/>
         </w:rPr>
-        <w:t xml:space="preserve">4.1. WACC reproduction (integrity check)</w:t>
+        <w:t xml:space="preserve">2.3. The regulatory enabler</w:t>
       </w:r>
     </w:p>
     <w:p>
@@ -507,7 +503,53 @@
           <w:sz w:val="21"/>
           <w:szCs w:val="21"/>
         </w:rPr>
-        <w:t xml:space="preserve">We recompute the real WACC as the weight-weighted sum of disclosed real component costs (Table 1). The result, 2.6288%, matches ADB’s reported 2.629% to four significant figures, confirming the disclosed components are internally consistent and the −0.708 pp viability gap is not an extraction error.</w:t>
+        <w:t xml:space="preserve">A tokenized InvIT presupposes that infrastructure units can be held by a broad investor base. Until late 2025 that was effectively blocked for privately placed structures by a ₹1 crore minimum subscription. SEBI’s InvIT (Third Amendment) Regulations, 2025, gazetted 2 September 2025, cut that minimum to ₹25 lakh and removed the ₹25 crore proviso (SEBI, 2025). This is the single most important regulatory precondition for a retail-accessible T-InvIT, and it is why we treat the reform as the policy hinge of the design proposal rather than as incidental context.</w:t>
+      </w:r>
+    </w:p>
+    <w:p>
+      <w:pPr>
+        <w:spacing w:after="120" w:before="280"/>
+      </w:pPr>
+      <w:r>
+        <w:rPr>
+          <w:rFonts w:ascii="Times New Roman" w:cs="Times New Roman" w:eastAsia="Times New Roman" w:hAnsi="Times New Roman"/>
+          <w:b/>
+          <w:bCs/>
+          <w:color w:val="1F3864"/>
+          <w:sz w:val="26"/>
+          <w:szCs w:val="26"/>
+        </w:rPr>
+        <w:t xml:space="preserve">3. Data and Provenance</w:t>
+      </w:r>
+    </w:p>
+    <w:p>
+      <w:pPr>
+        <w:spacing w:after="140" w:line="276"/>
+        <w:jc w:val="both"/>
+      </w:pPr>
+      <w:r>
+        <w:rPr>
+          <w:rFonts w:ascii="Times New Roman" w:cs="Times New Roman" w:eastAsia="Times New Roman" w:hAnsi="Times New Roman"/>
+          <w:sz w:val="21"/>
+          <w:szCs w:val="21"/>
+        </w:rPr>
+        <w:t xml:space="preserve">Every figure in this paper traces to a committed source or a logged retrieval. The metro economics — FIRR, WACC, WACC components, ridership anchors, fare, and cost — come from the ADB Financial Analysis (ADB Project 53326-001). ADB’s server returns HTTP 403 to automated download, so the canonical URL and the full extracted figure set are logged in data/raw/JICA_loans/ADB/ADB_FA_download_status.md rather than redistributed as a PDF. JICA Phase-3 loan terms come from JICA’s Ex-Ante Evaluation PDF, committed in full. PRR/BBC cost figures come from committed news and tender HTML under data/raw/PRR_BBC/. The SEBI amendment text is committed in the companion P2 repository. The full register is in DATA_SOURCES.md.</w:t>
+      </w:r>
+    </w:p>
+    <w:p>
+      <w:pPr>
+        <w:spacing w:after="120" w:before="280"/>
+      </w:pPr>
+      <w:r>
+        <w:rPr>
+          <w:rFonts w:ascii="Times New Roman" w:cs="Times New Roman" w:eastAsia="Times New Roman" w:hAnsi="Times New Roman"/>
+          <w:b/>
+          <w:bCs/>
+          <w:color w:val="1F3864"/>
+          <w:sz w:val="26"/>
+          <w:szCs w:val="26"/>
+        </w:rPr>
+        <w:t xml:space="preserve">4. Method</w:t>
       </w:r>
     </w:p>
     <w:p>
@@ -525,7 +567,7 @@
           <w:sz w:val="22"/>
           <w:szCs w:val="22"/>
         </w:rPr>
-        <w:t xml:space="preserve">4.2. Ridership and revenue forecast</w:t>
+        <w:t xml:space="preserve">4.1. WACC reproduction (integrity check)</w:t>
       </w:r>
     </w:p>
     <w:p>
@@ -539,87 +581,7 @@
           <w:sz w:val="21"/>
           <w:szCs w:val="21"/>
         </w:rPr>
-        <w:t xml:space="preserve">We anchor a 21-year (FY2025–FY2045) ridership path on ADB’s two published daily-ridership points and its stated 4.11% post-2031 growth. Between FY2025 and FY2031 we interpolate on the compound growth implied by ADB’s own anchors; after FY2031 we apply ADB’s 4.11% figure. Revenue is built from ADB’s fare assumption of ₹2.85 per passenger-km with non-farebox revenue at 10% of farebox after a two-year ramp; we apply a 12 km average trip length, flagged explicitly as our own assumption. Every forecast cell is labelled an “ADB-parameterised projection.”</w:t>
-      </w:r>
-    </w:p>
-    <w:p>
-      <w:pPr>
-        <w:spacing w:after="100" w:before="200"/>
-      </w:pPr>
-      <w:r>
-        <w:rPr>
-          <w:rFonts w:ascii="Times New Roman" w:cs="Times New Roman" w:eastAsia="Times New Roman" w:hAnsi="Times New Roman"/>
-          <w:b/>
-          <w:bCs/>
-          <w:i/>
-          <w:iCs/>
-          <w:color w:val="2E4B7A"/>
-          <w:sz w:val="22"/>
-          <w:szCs w:val="22"/>
-        </w:rPr>
-        <w:t xml:space="preserve">4.3. FIRR sensitivity and the tokenization scenario</w:t>
-      </w:r>
-    </w:p>
-    <w:p>
-      <w:pPr>
-        <w:spacing w:after="140" w:line="276"/>
-        <w:jc w:val="both"/>
-      </w:pPr>
-      <w:r>
-        <w:rPr>
-          <w:rFonts w:ascii="Times New Roman" w:cs="Times New Roman" w:eastAsia="Times New Roman" w:hAnsi="Times New Roman"/>
-          <w:sz w:val="21"/>
-          <w:szCs w:val="21"/>
-        </w:rPr>
-        <w:t xml:space="preserve">We perturb the base FIRR with an elasticity-style adjustment, scaling by a ridership factor and dividing by a cost factor, across ±20% shocks and a combined “+10% ridership, −10% cost” tokenization scenario. The scenario is deliberately modest: tokenization’s plausible channels are a lower cost of equity from a broader investor base and cost discipline from a deeper demand pool — not a doubling of ridership.</w:t>
-      </w:r>
-    </w:p>
-    <w:p>
-      <w:pPr>
-        <w:spacing w:after="120" w:before="280"/>
-      </w:pPr>
-      <w:r>
-        <w:rPr>
-          <w:rFonts w:ascii="Times New Roman" w:cs="Times New Roman" w:eastAsia="Times New Roman" w:hAnsi="Times New Roman"/>
-          <w:b/>
-          <w:bCs/>
-          <w:color w:val="1F3864"/>
-          <w:sz w:val="26"/>
-          <w:szCs w:val="26"/>
-        </w:rPr>
-        <w:t xml:space="preserve">5. Results</w:t>
-      </w:r>
-    </w:p>
-    <w:p>
-      <w:pPr>
-        <w:spacing w:after="100" w:before="200"/>
-      </w:pPr>
-      <w:r>
-        <w:rPr>
-          <w:rFonts w:ascii="Times New Roman" w:cs="Times New Roman" w:eastAsia="Times New Roman" w:hAnsi="Times New Roman"/>
-          <w:b/>
-          <w:bCs/>
-          <w:i/>
-          <w:iCs/>
-          <w:color w:val="2E4B7A"/>
-          <w:sz w:val="22"/>
-          <w:szCs w:val="22"/>
-        </w:rPr>
-        <w:t xml:space="preserve">5.1. The gap is real and consistent</w:t>
-      </w:r>
-    </w:p>
-    <w:p>
-      <w:pPr>
-        <w:spacing w:after="140" w:line="276"/>
-        <w:jc w:val="both"/>
-      </w:pPr>
-      <w:r>
-        <w:rPr>
-          <w:rFonts w:ascii="Times New Roman" w:cs="Times New Roman" w:eastAsia="Times New Roman" w:hAnsi="Times New Roman"/>
-          <w:sz w:val="21"/>
-          <w:szCs w:val="21"/>
-        </w:rPr>
-        <w:t xml:space="preserve">FIRR (1.921%) sits 0.708 percentage points below WACC (2.629%), and our component-level reconstruction reproduces the WACC almost exactly (Table 1, Figure 1). Without concessional capital the project does not clear its hurdle — which is why it is financed by JICA and ADB at near-zero real cost.</w:t>
+        <w:t xml:space="preserve">We recompute the real WACC as the weight-weighted sum of disclosed real component costs: JICA 17.24% at 0.00%, ADB 27.10% at 0.54%, equity 55.66% at 4.46% (Table 1). The result, 2.6288%, matches ADB’s reported 2.629% to four significant figures (data/processed/wacc_components.csv). This confirms the disclosed components are internally consistent and the −0.708 pp viability gap (FIRR 1.921% − WACC 2.629%) is not an extraction error.</w:t>
       </w:r>
     </w:p>
     <w:p>
@@ -1268,7 +1230,7 @@
           <w:sz w:val="18"/>
           <w:szCs w:val="18"/>
         </w:rPr>
-        <w:t xml:space="preserve">FIRR (1.921%) versus real WACC (2.629%) for Namma Metro Phase 2A/2B; the −0.708 pp viability gap.</w:t>
+        <w:t xml:space="preserve">ADB Bengaluru Metro Phase 2A/2B FIRR (1.921%) versus real WACC (2.629%): the −0.708 pp viability gap. Source: authors’ reconstruction from ADB (2020); notebooks/02_firr_wacc_forecast.py.</w:t>
       </w:r>
     </w:p>
     <w:p>
@@ -1286,7 +1248,7 @@
           <w:sz w:val="22"/>
           <w:szCs w:val="22"/>
         </w:rPr>
-        <w:t xml:space="preserve">5.2. Ridership and revenue trajectory</w:t>
+        <w:t xml:space="preserve">4.2. Ridership and revenue forecast</w:t>
       </w:r>
     </w:p>
     <w:p>
@@ -1300,7 +1262,147 @@
           <w:sz w:val="21"/>
           <w:szCs w:val="21"/>
         </w:rPr>
-        <w:t xml:space="preserve">The ADB-parameterised forecast takes total daily ridership from about 157,594 in FY2025 to roughly 600,651 by FY2031 — matching ADB’s anchors by construction — and to just over 1.05 million by FY2045 under the 4.11% post-2031 path (Figure 2). Corresponding operating revenue rises from about ₹197 crore in FY2025 to ₹825 crore by FY2031 and ₹1,450 crore by FY2045 on ADB’s fare assumptions (Figure 3). These are the cash flows any tokenized equity claim would be priced against.</w:t>
+        <w:t xml:space="preserve">We anchor a 21-year (FY2025–FY2045) ridership path on ADB’s two published daily-ridership points and its stated 4.11% post-2031 growth. Between FY2025 and FY2031 we interpolate on the compound growth implied by ADB’s own anchors; after FY2031 we apply ADB’s 4.11% figure. Revenue is built from ADB’s fare assumption of ₹2.85 per passenger-km with non-farebox revenue at 10% of farebox after a two-year ramp; we apply a 12 km average trip length, flagged explicitly as our own assumption.</w:t>
+      </w:r>
+    </w:p>
+    <w:p>
+      <w:pPr>
+        <w:spacing w:after="100" w:before="200"/>
+      </w:pPr>
+      <w:r>
+        <w:rPr>
+          <w:rFonts w:ascii="Times New Roman" w:cs="Times New Roman" w:eastAsia="Times New Roman" w:hAnsi="Times New Roman"/>
+          <w:b/>
+          <w:bCs/>
+          <w:i/>
+          <w:iCs/>
+          <w:color w:val="2E4B7A"/>
+          <w:sz w:val="22"/>
+          <w:szCs w:val="22"/>
+        </w:rPr>
+        <w:t xml:space="preserve">4.3. A discounted-cash-flow FIRR model and Monte Carlo simulation</w:t>
+      </w:r>
+    </w:p>
+    <w:p>
+      <w:pPr>
+        <w:spacing w:after="140" w:line="276"/>
+        <w:jc w:val="both"/>
+      </w:pPr>
+      <w:r>
+        <w:rPr>
+          <w:rFonts w:ascii="Times New Roman" w:cs="Times New Roman" w:eastAsia="Times New Roman" w:hAnsi="Times New Roman"/>
+          <w:sz w:val="21"/>
+          <w:szCs w:val="21"/>
+        </w:rPr>
+        <w:t xml:space="preserve">Earlier drafts perturbed the headline FIRR with a crude elasticity heuristic (scaling by a ridership factor, dividing by a cost factor). We replace that entirely with an explicit discounted-cash-flow model. We build the project’s net cash-flow stream over a 30-year horizon — five construction years and 25 operating years — from ADB’s disclosed parameters: total capital cost of ₹139,088.8 million, an EBITDA margin of ~41%, a corporate tax rate of 16.69%, a 20% terminal salvage value, the ₹2.85 per passenger-km fare, the 12 km average trip length (our assumption, flagged), and the ADB-anchored ridership path. We solve for the internal rate of return of this stream directly.</w:t>
+      </w:r>
+    </w:p>
+    <w:p>
+      <w:pPr>
+        <w:spacing w:after="140" w:line="276"/>
+        <w:jc w:val="both"/>
+      </w:pPr>
+      <w:r>
+        <w:rPr>
+          <w:rFonts w:ascii="Times New Roman" w:cs="Times New Roman" w:eastAsia="Times New Roman" w:hAnsi="Times New Roman"/>
+          <w:sz w:val="21"/>
+          <w:szCs w:val="21"/>
+        </w:rPr>
+        <w:t xml:space="preserve">The raw model IRR is −1.022%, below ADB’s published 1.921%; the difference reflects line-item detail in ADB’s full model that is not public. Rather than discard the discrepancy, we apply a single transparent additive calibration shift of +2.943 percentage points so the base case reproduces ADB’s published FIRR exactly, and we log the shift in data/processed/calibration_log.csv. This is a benchmark calibration of the model’s relative sensitivities to ADB’s level, not a free parameter: the shift is fixed once, documented, and applied uniformly across all simulation draws.</w:t>
+      </w:r>
+    </w:p>
+    <w:p>
+      <w:pPr>
+        <w:spacing w:after="140" w:line="276"/>
+        <w:jc w:val="both"/>
+      </w:pPr>
+      <w:r>
+        <w:rPr>
+          <w:rFonts w:ascii="Times New Roman" w:cs="Times New Roman" w:eastAsia="Times New Roman" w:hAnsi="Times New Roman"/>
+          <w:sz w:val="21"/>
+          <w:szCs w:val="21"/>
+        </w:rPr>
+        <w:t xml:space="preserve">We then run a 20,000-draw Monte Carlo simulation (seed 53326) drawing seven assumptions from calibrated ranges (data/processed/assumption_ranges.csv): the ridership multiplier, average trip length, capital-cost multiplier, salvage value, EBITDA margin, fare, and post-2031 growth. For each draw we recompute the calibrated FIRR, giving a full predictive distribution, the probability of clearing WACC, and a Spearman-rank tornado of which assumptions drive FIRR variance. Finally, to isolate tokenization’s actual mechanism, we sweep the cost of equity downward in 10-basis-point steps and record the equity-cost reduction at which the recomputed WACC falls to meet the FIRR (data/processed/tokenization_coe_sweep.csv).</w:t>
+      </w:r>
+    </w:p>
+    <w:p>
+      <w:pPr>
+        <w:spacing w:after="120" w:before="280"/>
+      </w:pPr>
+      <w:r>
+        <w:rPr>
+          <w:rFonts w:ascii="Times New Roman" w:cs="Times New Roman" w:eastAsia="Times New Roman" w:hAnsi="Times New Roman"/>
+          <w:b/>
+          <w:bCs/>
+          <w:color w:val="1F3864"/>
+          <w:sz w:val="26"/>
+          <w:szCs w:val="26"/>
+        </w:rPr>
+        <w:t xml:space="preserve">5. Results</w:t>
+      </w:r>
+    </w:p>
+    <w:p>
+      <w:pPr>
+        <w:spacing w:after="100" w:before="200"/>
+      </w:pPr>
+      <w:r>
+        <w:rPr>
+          <w:rFonts w:ascii="Times New Roman" w:cs="Times New Roman" w:eastAsia="Times New Roman" w:hAnsi="Times New Roman"/>
+          <w:b/>
+          <w:bCs/>
+          <w:i/>
+          <w:iCs/>
+          <w:color w:val="2E4B7A"/>
+          <w:sz w:val="22"/>
+          <w:szCs w:val="22"/>
+        </w:rPr>
+        <w:t xml:space="preserve">5.1. The gap is real and consistent</w:t>
+      </w:r>
+    </w:p>
+    <w:p>
+      <w:pPr>
+        <w:spacing w:after="140" w:line="276"/>
+        <w:jc w:val="both"/>
+      </w:pPr>
+      <w:r>
+        <w:rPr>
+          <w:rFonts w:ascii="Times New Roman" w:cs="Times New Roman" w:eastAsia="Times New Roman" w:hAnsi="Times New Roman"/>
+          <w:sz w:val="21"/>
+          <w:szCs w:val="21"/>
+        </w:rPr>
+        <w:t xml:space="preserve">FIRR (1.921%) sits 0.708 percentage points below WACC (2.629%), and our component-level reconstruction reproduces the WACC almost exactly (2.6288%, Table 1, Figure 1). Without concessional capital the project does not clear its hurdle — which is exactly why it is financed by JICA and ADB at near-zero real cost.</w:t>
+      </w:r>
+    </w:p>
+    <w:p>
+      <w:pPr>
+        <w:spacing w:after="100" w:before="200"/>
+      </w:pPr>
+      <w:r>
+        <w:rPr>
+          <w:rFonts w:ascii="Times New Roman" w:cs="Times New Roman" w:eastAsia="Times New Roman" w:hAnsi="Times New Roman"/>
+          <w:b/>
+          <w:bCs/>
+          <w:i/>
+          <w:iCs/>
+          <w:color w:val="2E4B7A"/>
+          <w:sz w:val="22"/>
+          <w:szCs w:val="22"/>
+        </w:rPr>
+        <w:t xml:space="preserve">5.2. Ridership and revenue trajectory</w:t>
+      </w:r>
+    </w:p>
+    <w:p>
+      <w:pPr>
+        <w:spacing w:after="140" w:line="276"/>
+        <w:jc w:val="both"/>
+      </w:pPr>
+      <w:r>
+        <w:rPr>
+          <w:rFonts w:ascii="Times New Roman" w:cs="Times New Roman" w:eastAsia="Times New Roman" w:hAnsi="Times New Roman"/>
+          <w:sz w:val="21"/>
+          <w:szCs w:val="21"/>
+        </w:rPr>
+        <w:t xml:space="preserve">The ADB-parameterised forecast takes total daily ridership from about 157,594 in FY2025 to roughly 600,651 by FY2031 — matching ADB’s anchors by construction — and to just over 1.05 million by FY2045 under the 4.11% post-2031 path (Figure 2). The corresponding operating revenue rises from about ₹197 crore in FY2025 to ₹825 crore by FY2031 and ₹1,450 crore by FY2045 on ADB’s fare assumptions (Figure 3). These are the cash flows any tokenized equity claim would ultimately be priced against.</w:t>
       </w:r>
     </w:p>
     <w:p>
@@ -1372,7 +1474,7 @@
           <w:sz w:val="18"/>
           <w:szCs w:val="18"/>
         </w:rPr>
-        <w:t xml:space="preserve">Ridership forecast: ADB anchors (FY2025, FY2031, red markers) plus 4.11% p.a. post-2031.</w:t>
+        <w:t xml:space="preserve">ADB-parameterised daily ridership forecast for Bengaluru Metro Phase 2A/2B, FY2025–FY2045. Anchored on ADB published points; notebooks/02_firr_wacc_forecast.py.</w:t>
       </w:r>
     </w:p>
     <w:p>
@@ -1444,7 +1546,7 @@
           <w:sz w:val="18"/>
           <w:szCs w:val="18"/>
         </w:rPr>
-        <w:t xml:space="preserve">Projected operating revenue (₹ crore) on ADB fare assumptions (₹2.85/pax-km, 12 km average lead).</w:t>
+        <w:t xml:space="preserve">Projected operating revenue (₹ crore) for Bengaluru Metro Phase 2A/2B, FY2025–FY2045. Built on ADB fare assumptions; notebooks/02_firr_wacc_forecast.py.</w:t>
       </w:r>
     </w:p>
     <w:p>
@@ -1462,7 +1564,7 @@
           <w:sz w:val="22"/>
           <w:szCs w:val="22"/>
         </w:rPr>
-        <w:t xml:space="preserve">5.3. How far tokenization can move the needle</w:t>
+        <w:t xml:space="preserve">5.3. The Monte Carlo FIRR distribution and what drives it</w:t>
       </w:r>
     </w:p>
     <w:p>
@@ -1476,522 +1578,7 @@
           <w:sz w:val="21"/>
           <w:szCs w:val="21"/>
         </w:rPr>
-        <w:t xml:space="preserve">The sensitivity analysis is the paper’s sobering centrepiece (Table 2, Figure 4). A 20% ridership uplift alone lifts FIRR to about 2.31%; a 20% cost reduction to about 2.40%; the combined tokenization scenario to about 2.35%. Every scenario remains below the 2.629% WACC. Even optimistic tokenization-driven improvements compress the viability gap from −0.708 pp to roughly −0.28 pp but do not close it. The policy reading: tokenization is a subsidy-reducing instrument, not a route to an unsubsidized, market-viable metro.</w:t>
-      </w:r>
-    </w:p>
-    <w:p>
-      <w:pPr>
-        <w:spacing w:after="60" w:before="200"/>
-        <w:jc w:val="left"/>
-      </w:pPr>
-      <w:r>
-        <w:rPr>
-          <w:rFonts w:ascii="Calibri" w:cs="Calibri" w:eastAsia="Calibri" w:hAnsi="Calibri"/>
-          <w:b/>
-          <w:bCs/>
-          <w:sz w:val="19"/>
-          <w:szCs w:val="19"/>
-        </w:rPr>
-        <w:t xml:space="preserve">Table 2. </w:t>
-      </w:r>
-      <w:r>
-        <w:rPr>
-          <w:rFonts w:ascii="Calibri" w:cs="Calibri" w:eastAsia="Calibri" w:hAnsi="Calibri"/>
-          <w:sz w:val="19"/>
-          <w:szCs w:val="19"/>
-        </w:rPr>
-        <w:t xml:space="preserve">FIRR sensitivity (model simulation around the ADB base FIRR of 1.921%).</w:t>
-      </w:r>
-    </w:p>
-    <w:tbl>
-      <w:tblPr>
-        <w:tblW w:type="pct" w:w="100%"/>
-        <w:tblBorders>
-          <w:top w:val="single" w:color="1F3864" w:sz="4"/>
-          <w:left w:val="none"/>
-          <w:bottom w:val="single" w:color="1F3864" w:sz="4"/>
-          <w:right w:val="none"/>
-          <w:insideH w:val="single" w:color="BFBFBF" w:sz="2"/>
-          <w:insideV w:val="none"/>
-        </w:tblBorders>
-      </w:tblPr>
-      <w:tblGrid>
-        <w:gridCol w:w="100"/>
-        <w:gridCol w:w="100"/>
-        <w:gridCol w:w="100"/>
-      </w:tblGrid>
-      <w:tr>
-        <w:trPr>
-          <w:tblHeader/>
-        </w:trPr>
-        <w:tc>
-          <w:tcPr>
-            <w:shd w:fill="1F3864" w:val="clear"/>
-            <w:tcMar>
-              <w:top w:type="dxa" w:w="40"/>
-              <w:left w:type="dxa" w:w="80"/>
-              <w:bottom w:type="dxa" w:w="40"/>
-              <w:right w:type="dxa" w:w="80"/>
-            </w:tcMar>
-          </w:tcPr>
-          <w:p>
-            <w:r>
-              <w:rPr>
-                <w:rFonts w:ascii="Times New Roman" w:cs="Times New Roman" w:eastAsia="Times New Roman" w:hAnsi="Times New Roman"/>
-                <w:b/>
-                <w:bCs/>
-                <w:color w:val="FFFFFF"/>
-                <w:sz w:val="18"/>
-                <w:szCs w:val="18"/>
-              </w:rPr>
-              <w:t xml:space="preserve">Scenario</w:t>
-            </w:r>
-          </w:p>
-        </w:tc>
-        <w:tc>
-          <w:tcPr>
-            <w:shd w:fill="1F3864" w:val="clear"/>
-            <w:tcMar>
-              <w:top w:type="dxa" w:w="40"/>
-              <w:left w:type="dxa" w:w="80"/>
-              <w:bottom w:type="dxa" w:w="40"/>
-              <w:right w:type="dxa" w:w="80"/>
-            </w:tcMar>
-          </w:tcPr>
-          <w:p>
-            <w:r>
-              <w:rPr>
-                <w:rFonts w:ascii="Times New Roman" w:cs="Times New Roman" w:eastAsia="Times New Roman" w:hAnsi="Times New Roman"/>
-                <w:b/>
-                <w:bCs/>
-                <w:color w:val="FFFFFF"/>
-                <w:sz w:val="18"/>
-                <w:szCs w:val="18"/>
-              </w:rPr>
-              <w:t xml:space="preserve">FIRR</w:t>
-            </w:r>
-          </w:p>
-        </w:tc>
-        <w:tc>
-          <w:tcPr>
-            <w:shd w:fill="1F3864" w:val="clear"/>
-            <w:tcMar>
-              <w:top w:type="dxa" w:w="40"/>
-              <w:left w:type="dxa" w:w="80"/>
-              <w:bottom w:type="dxa" w:w="40"/>
-              <w:right w:type="dxa" w:w="80"/>
-            </w:tcMar>
-          </w:tcPr>
-          <w:p>
-            <w:r>
-              <w:rPr>
-                <w:rFonts w:ascii="Times New Roman" w:cs="Times New Roman" w:eastAsia="Times New Roman" w:hAnsi="Times New Roman"/>
-                <w:b/>
-                <w:bCs/>
-                <w:color w:val="FFFFFF"/>
-                <w:sz w:val="18"/>
-                <w:szCs w:val="18"/>
-              </w:rPr>
-              <w:t xml:space="preserve">vs WACC (2.629%)</w:t>
-            </w:r>
-          </w:p>
-        </w:tc>
-      </w:tr>
-      <w:tr>
-        <w:tc>
-          <w:tcPr>
-            <w:tcMar>
-              <w:top w:type="dxa" w:w="40"/>
-              <w:left w:type="dxa" w:w="80"/>
-              <w:bottom w:type="dxa" w:w="40"/>
-              <w:right w:type="dxa" w:w="80"/>
-            </w:tcMar>
-          </w:tcPr>
-          <w:p>
-            <w:r>
-              <w:rPr>
-                <w:rFonts w:ascii="Times New Roman" w:cs="Times New Roman" w:eastAsia="Times New Roman" w:hAnsi="Times New Roman"/>
-                <w:sz w:val="18"/>
-                <w:szCs w:val="18"/>
-              </w:rPr>
-              <w:t xml:space="preserve">Base case (ADB)</w:t>
-            </w:r>
-          </w:p>
-        </w:tc>
-        <w:tc>
-          <w:tcPr>
-            <w:tcMar>
-              <w:top w:type="dxa" w:w="40"/>
-              <w:left w:type="dxa" w:w="80"/>
-              <w:bottom w:type="dxa" w:w="40"/>
-              <w:right w:type="dxa" w:w="80"/>
-            </w:tcMar>
-          </w:tcPr>
-          <w:p>
-            <w:r>
-              <w:rPr>
-                <w:rFonts w:ascii="Times New Roman" w:cs="Times New Roman" w:eastAsia="Times New Roman" w:hAnsi="Times New Roman"/>
-                <w:sz w:val="18"/>
-                <w:szCs w:val="18"/>
-              </w:rPr>
-              <w:t xml:space="preserve">1.921%</w:t>
-            </w:r>
-          </w:p>
-        </w:tc>
-        <w:tc>
-          <w:tcPr>
-            <w:tcMar>
-              <w:top w:type="dxa" w:w="40"/>
-              <w:left w:type="dxa" w:w="80"/>
-              <w:bottom w:type="dxa" w:w="40"/>
-              <w:right w:type="dxa" w:w="80"/>
-            </w:tcMar>
-          </w:tcPr>
-          <w:p>
-            <w:r>
-              <w:rPr>
-                <w:rFonts w:ascii="Times New Roman" w:cs="Times New Roman" w:eastAsia="Times New Roman" w:hAnsi="Times New Roman"/>
-                <w:sz w:val="18"/>
-                <w:szCs w:val="18"/>
-              </w:rPr>
-              <w:t xml:space="preserve">Needs subsidy</w:t>
-            </w:r>
-          </w:p>
-        </w:tc>
-      </w:tr>
-      <w:tr>
-        <w:tc>
-          <w:tcPr>
-            <w:shd w:fill="EFF2F7" w:val="clear"/>
-            <w:tcMar>
-              <w:top w:type="dxa" w:w="40"/>
-              <w:left w:type="dxa" w:w="80"/>
-              <w:bottom w:type="dxa" w:w="40"/>
-              <w:right w:type="dxa" w:w="80"/>
-            </w:tcMar>
-          </w:tcPr>
-          <w:p>
-            <w:r>
-              <w:rPr>
-                <w:rFonts w:ascii="Times New Roman" w:cs="Times New Roman" w:eastAsia="Times New Roman" w:hAnsi="Times New Roman"/>
-                <w:sz w:val="18"/>
-                <w:szCs w:val="18"/>
-              </w:rPr>
-              <w:t xml:space="preserve">Ridership +20%</w:t>
-            </w:r>
-          </w:p>
-        </w:tc>
-        <w:tc>
-          <w:tcPr>
-            <w:shd w:fill="EFF2F7" w:val="clear"/>
-            <w:tcMar>
-              <w:top w:type="dxa" w:w="40"/>
-              <w:left w:type="dxa" w:w="80"/>
-              <w:bottom w:type="dxa" w:w="40"/>
-              <w:right w:type="dxa" w:w="80"/>
-            </w:tcMar>
-          </w:tcPr>
-          <w:p>
-            <w:r>
-              <w:rPr>
-                <w:rFonts w:ascii="Times New Roman" w:cs="Times New Roman" w:eastAsia="Times New Roman" w:hAnsi="Times New Roman"/>
-                <w:sz w:val="18"/>
-                <w:szCs w:val="18"/>
-              </w:rPr>
-              <w:t xml:space="preserve">2.305%</w:t>
-            </w:r>
-          </w:p>
-        </w:tc>
-        <w:tc>
-          <w:tcPr>
-            <w:shd w:fill="EFF2F7" w:val="clear"/>
-            <w:tcMar>
-              <w:top w:type="dxa" w:w="40"/>
-              <w:left w:type="dxa" w:w="80"/>
-              <w:bottom w:type="dxa" w:w="40"/>
-              <w:right w:type="dxa" w:w="80"/>
-            </w:tcMar>
-          </w:tcPr>
-          <w:p>
-            <w:r>
-              <w:rPr>
-                <w:rFonts w:ascii="Times New Roman" w:cs="Times New Roman" w:eastAsia="Times New Roman" w:hAnsi="Times New Roman"/>
-                <w:sz w:val="18"/>
-                <w:szCs w:val="18"/>
-              </w:rPr>
-              <w:t xml:space="preserve">Needs subsidy</w:t>
-            </w:r>
-          </w:p>
-        </w:tc>
-      </w:tr>
-      <w:tr>
-        <w:tc>
-          <w:tcPr>
-            <w:tcMar>
-              <w:top w:type="dxa" w:w="40"/>
-              <w:left w:type="dxa" w:w="80"/>
-              <w:bottom w:type="dxa" w:w="40"/>
-              <w:right w:type="dxa" w:w="80"/>
-            </w:tcMar>
-          </w:tcPr>
-          <w:p>
-            <w:r>
-              <w:rPr>
-                <w:rFonts w:ascii="Times New Roman" w:cs="Times New Roman" w:eastAsia="Times New Roman" w:hAnsi="Times New Roman"/>
-                <w:sz w:val="18"/>
-                <w:szCs w:val="18"/>
-              </w:rPr>
-              <w:t xml:space="preserve">Ridership −20%</w:t>
-            </w:r>
-          </w:p>
-        </w:tc>
-        <w:tc>
-          <w:tcPr>
-            <w:tcMar>
-              <w:top w:type="dxa" w:w="40"/>
-              <w:left w:type="dxa" w:w="80"/>
-              <w:bottom w:type="dxa" w:w="40"/>
-              <w:right w:type="dxa" w:w="80"/>
-            </w:tcMar>
-          </w:tcPr>
-          <w:p>
-            <w:r>
-              <w:rPr>
-                <w:rFonts w:ascii="Times New Roman" w:cs="Times New Roman" w:eastAsia="Times New Roman" w:hAnsi="Times New Roman"/>
-                <w:sz w:val="18"/>
-                <w:szCs w:val="18"/>
-              </w:rPr>
-              <w:t xml:space="preserve">1.537%</w:t>
-            </w:r>
-          </w:p>
-        </w:tc>
-        <w:tc>
-          <w:tcPr>
-            <w:tcMar>
-              <w:top w:type="dxa" w:w="40"/>
-              <w:left w:type="dxa" w:w="80"/>
-              <w:bottom w:type="dxa" w:w="40"/>
-              <w:right w:type="dxa" w:w="80"/>
-            </w:tcMar>
-          </w:tcPr>
-          <w:p>
-            <w:r>
-              <w:rPr>
-                <w:rFonts w:ascii="Times New Roman" w:cs="Times New Roman" w:eastAsia="Times New Roman" w:hAnsi="Times New Roman"/>
-                <w:sz w:val="18"/>
-                <w:szCs w:val="18"/>
-              </w:rPr>
-              <w:t xml:space="preserve">Needs subsidy</w:t>
-            </w:r>
-          </w:p>
-        </w:tc>
-      </w:tr>
-      <w:tr>
-        <w:tc>
-          <w:tcPr>
-            <w:shd w:fill="EFF2F7" w:val="clear"/>
-            <w:tcMar>
-              <w:top w:type="dxa" w:w="40"/>
-              <w:left w:type="dxa" w:w="80"/>
-              <w:bottom w:type="dxa" w:w="40"/>
-              <w:right w:type="dxa" w:w="80"/>
-            </w:tcMar>
-          </w:tcPr>
-          <w:p>
-            <w:r>
-              <w:rPr>
-                <w:rFonts w:ascii="Times New Roman" w:cs="Times New Roman" w:eastAsia="Times New Roman" w:hAnsi="Times New Roman"/>
-                <w:sz w:val="18"/>
-                <w:szCs w:val="18"/>
-              </w:rPr>
-              <w:t xml:space="preserve">Cost +20%</w:t>
-            </w:r>
-          </w:p>
-        </w:tc>
-        <w:tc>
-          <w:tcPr>
-            <w:shd w:fill="EFF2F7" w:val="clear"/>
-            <w:tcMar>
-              <w:top w:type="dxa" w:w="40"/>
-              <w:left w:type="dxa" w:w="80"/>
-              <w:bottom w:type="dxa" w:w="40"/>
-              <w:right w:type="dxa" w:w="80"/>
-            </w:tcMar>
-          </w:tcPr>
-          <w:p>
-            <w:r>
-              <w:rPr>
-                <w:rFonts w:ascii="Times New Roman" w:cs="Times New Roman" w:eastAsia="Times New Roman" w:hAnsi="Times New Roman"/>
-                <w:sz w:val="18"/>
-                <w:szCs w:val="18"/>
-              </w:rPr>
-              <w:t xml:space="preserve">1.601%</w:t>
-            </w:r>
-          </w:p>
-        </w:tc>
-        <w:tc>
-          <w:tcPr>
-            <w:shd w:fill="EFF2F7" w:val="clear"/>
-            <w:tcMar>
-              <w:top w:type="dxa" w:w="40"/>
-              <w:left w:type="dxa" w:w="80"/>
-              <w:bottom w:type="dxa" w:w="40"/>
-              <w:right w:type="dxa" w:w="80"/>
-            </w:tcMar>
-          </w:tcPr>
-          <w:p>
-            <w:r>
-              <w:rPr>
-                <w:rFonts w:ascii="Times New Roman" w:cs="Times New Roman" w:eastAsia="Times New Roman" w:hAnsi="Times New Roman"/>
-                <w:sz w:val="18"/>
-                <w:szCs w:val="18"/>
-              </w:rPr>
-              <w:t xml:space="preserve">Needs subsidy</w:t>
-            </w:r>
-          </w:p>
-        </w:tc>
-      </w:tr>
-      <w:tr>
-        <w:tc>
-          <w:tcPr>
-            <w:tcMar>
-              <w:top w:type="dxa" w:w="40"/>
-              <w:left w:type="dxa" w:w="80"/>
-              <w:bottom w:type="dxa" w:w="40"/>
-              <w:right w:type="dxa" w:w="80"/>
-            </w:tcMar>
-          </w:tcPr>
-          <w:p>
-            <w:r>
-              <w:rPr>
-                <w:rFonts w:ascii="Times New Roman" w:cs="Times New Roman" w:eastAsia="Times New Roman" w:hAnsi="Times New Roman"/>
-                <w:sz w:val="18"/>
-                <w:szCs w:val="18"/>
-              </w:rPr>
-              <w:t xml:space="preserve">Cost −20%</w:t>
-            </w:r>
-          </w:p>
-        </w:tc>
-        <w:tc>
-          <w:tcPr>
-            <w:tcMar>
-              <w:top w:type="dxa" w:w="40"/>
-              <w:left w:type="dxa" w:w="80"/>
-              <w:bottom w:type="dxa" w:w="40"/>
-              <w:right w:type="dxa" w:w="80"/>
-            </w:tcMar>
-          </w:tcPr>
-          <w:p>
-            <w:r>
-              <w:rPr>
-                <w:rFonts w:ascii="Times New Roman" w:cs="Times New Roman" w:eastAsia="Times New Roman" w:hAnsi="Times New Roman"/>
-                <w:sz w:val="18"/>
-                <w:szCs w:val="18"/>
-              </w:rPr>
-              <w:t xml:space="preserve">2.401%</w:t>
-            </w:r>
-          </w:p>
-        </w:tc>
-        <w:tc>
-          <w:tcPr>
-            <w:tcMar>
-              <w:top w:type="dxa" w:w="40"/>
-              <w:left w:type="dxa" w:w="80"/>
-              <w:bottom w:type="dxa" w:w="40"/>
-              <w:right w:type="dxa" w:w="80"/>
-            </w:tcMar>
-          </w:tcPr>
-          <w:p>
-            <w:r>
-              <w:rPr>
-                <w:rFonts w:ascii="Times New Roman" w:cs="Times New Roman" w:eastAsia="Times New Roman" w:hAnsi="Times New Roman"/>
-                <w:sz w:val="18"/>
-                <w:szCs w:val="18"/>
-              </w:rPr>
-              <w:t xml:space="preserve">Needs subsidy</w:t>
-            </w:r>
-          </w:p>
-        </w:tc>
-      </w:tr>
-      <w:tr>
-        <w:tc>
-          <w:tcPr>
-            <w:shd w:fill="EFF2F7" w:val="clear"/>
-            <w:tcMar>
-              <w:top w:type="dxa" w:w="40"/>
-              <w:left w:type="dxa" w:w="80"/>
-              <w:bottom w:type="dxa" w:w="40"/>
-              <w:right w:type="dxa" w:w="80"/>
-            </w:tcMar>
-          </w:tcPr>
-          <w:p>
-            <w:r>
-              <w:rPr>
-                <w:rFonts w:ascii="Times New Roman" w:cs="Times New Roman" w:eastAsia="Times New Roman" w:hAnsi="Times New Roman"/>
-                <w:sz w:val="18"/>
-                <w:szCs w:val="18"/>
-              </w:rPr>
-              <w:t xml:space="preserve">T-InvIT (+10% rid, −10% cost)</w:t>
-            </w:r>
-          </w:p>
-        </w:tc>
-        <w:tc>
-          <w:tcPr>
-            <w:shd w:fill="EFF2F7" w:val="clear"/>
-            <w:tcMar>
-              <w:top w:type="dxa" w:w="40"/>
-              <w:left w:type="dxa" w:w="80"/>
-              <w:bottom w:type="dxa" w:w="40"/>
-              <w:right w:type="dxa" w:w="80"/>
-            </w:tcMar>
-          </w:tcPr>
-          <w:p>
-            <w:r>
-              <w:rPr>
-                <w:rFonts w:ascii="Times New Roman" w:cs="Times New Roman" w:eastAsia="Times New Roman" w:hAnsi="Times New Roman"/>
-                <w:sz w:val="18"/>
-                <w:szCs w:val="18"/>
-              </w:rPr>
-              <w:t xml:space="preserve">2.348%</w:t>
-            </w:r>
-          </w:p>
-        </w:tc>
-        <w:tc>
-          <w:tcPr>
-            <w:shd w:fill="EFF2F7" w:val="clear"/>
-            <w:tcMar>
-              <w:top w:type="dxa" w:w="40"/>
-              <w:left w:type="dxa" w:w="80"/>
-              <w:bottom w:type="dxa" w:w="40"/>
-              <w:right w:type="dxa" w:w="80"/>
-            </w:tcMar>
-          </w:tcPr>
-          <w:p>
-            <w:r>
-              <w:rPr>
-                <w:rFonts w:ascii="Times New Roman" w:cs="Times New Roman" w:eastAsia="Times New Roman" w:hAnsi="Times New Roman"/>
-                <w:sz w:val="18"/>
-                <w:szCs w:val="18"/>
-              </w:rPr>
-              <w:t xml:space="preserve">Needs subsidy</w:t>
-            </w:r>
-          </w:p>
-        </w:tc>
-      </w:tr>
-    </w:tbl>
-    <w:p>
-      <w:pPr>
-        <w:spacing w:after="160"/>
-      </w:pPr>
-      <w:r>
-        <w:rPr>
-          <w:rFonts w:ascii="Times New Roman" w:cs="Times New Roman" w:eastAsia="Times New Roman" w:hAnsi="Times New Roman"/>
-          <w:i/>
-          <w:iCs/>
-          <w:sz w:val="16"/>
-          <w:szCs w:val="16"/>
-        </w:rPr>
-        <w:t xml:space="preserve">Source: data/processed/firr_sensitivity_table.csv.</w:t>
+        <w:t xml:space="preserve">The simulation is the paper’s sobering centrepiece. Across 20,000 draws the calibrated FIRR has a mean of 1.60% and a median of 1.60%, with a standard deviation of 0.84 percentage points and a 90% interval of 0.22% to 2.96% (data/processed/mc_firr_summary.csv). The project almost always earns a positive return — the probability that FIRR exceeds zero is 97.2% — but the probability that it clears its 2.629% real WACC is only 10.9%. In other words, even allowing optimistic draws on ridership, fare, and cost simultaneously, the project clears its hurdle roughly one time in nine; the modal outcome is a project that is positive-return but sub-WACC, exactly the profile that requires concessional support. Figure 5 plots the full distribution against the WACC line.</w:t>
       </w:r>
     </w:p>
     <w:p>
@@ -2002,7 +1589,7 @@
       <w:r>
         <w:drawing>
           <wp:inline distT="0" distB="0" distL="0" distR="0">
-            <wp:extent cx="4953000" cy="3095625"/>
+            <wp:extent cx="5334000" cy="3333750"/>
             <wp:effectExtent t="0" r="0" b="0" l="0"/>
             <wp:docPr id="1" name="" descr="" title=""/>
             <wp:cNvGraphicFramePr>
@@ -2027,6 +1614,669 @@
                   <pic:spPr bwMode="auto">
                     <a:xfrm>
                       <a:off x="0" y="0"/>
+                      <a:ext cx="5334000" cy="3333750"/>
+                    </a:xfrm>
+                    <a:prstGeom prst="rect">
+                      <a:avLst/>
+                    </a:prstGeom>
+                  </pic:spPr>
+                </pic:pic>
+              </a:graphicData>
+            </a:graphic>
+          </wp:inline>
+        </w:drawing>
+      </w:r>
+    </w:p>
+    <w:p>
+      <w:pPr>
+        <w:spacing w:after="200"/>
+        <w:jc w:val="center"/>
+      </w:pPr>
+      <w:r>
+        <w:rPr>
+          <w:rFonts w:ascii="Calibri" w:cs="Calibri" w:eastAsia="Calibri" w:hAnsi="Calibri"/>
+          <w:b/>
+          <w:bCs/>
+          <w:sz w:val="18"/>
+          <w:szCs w:val="18"/>
+        </w:rPr>
+        <w:t xml:space="preserve">Figure 5. </w:t>
+      </w:r>
+      <w:r>
+        <w:rPr>
+          <w:rFonts w:ascii="Calibri" w:cs="Calibri" w:eastAsia="Calibri" w:hAnsi="Calibri"/>
+          <w:i/>
+          <w:iCs/>
+          <w:sz w:val="18"/>
+          <w:szCs w:val="18"/>
+        </w:rPr>
+        <w:t xml:space="preserve">Monte Carlo distribution of the simulated FIRR (20,000 draws) against the 2.629% real WACC; the probability of clearing WACC is 10.9%. Seed 53326; notebooks/03_montecarlo_firr.py.</w:t>
+      </w:r>
+    </w:p>
+    <w:p>
+      <w:pPr>
+        <w:spacing w:after="140" w:line="276"/>
+        <w:jc w:val="both"/>
+      </w:pPr>
+      <w:r>
+        <w:rPr>
+          <w:rFonts w:ascii="Times New Roman" w:cs="Times New Roman" w:eastAsia="Times New Roman" w:hAnsi="Times New Roman"/>
+          <w:sz w:val="21"/>
+          <w:szCs w:val="21"/>
+        </w:rPr>
+        <w:t xml:space="preserve">The Spearman-rank tornado decomposes where that uncertainty comes from (Table 2, data/processed/firr_tornado.csv). The ridership multiplier is the dominant driver (20.7% of attributed variance), followed by the average trip length (17.5%) — which is notable because trip length is our own assumption, not ADB’s, and so warrants the sensitivity scrutiny — then the capital-cost multiplier (16.5%), salvage value (12.6%), EBITDA margin (12.3%), fare (10.3%), and post-2031 growth (10.0%). The ordering is intuitive: this is a demand-and-capex story far more than a fare or terminal-value story. Figure 6 shows the tornado.</w:t>
+      </w:r>
+    </w:p>
+    <w:p>
+      <w:pPr>
+        <w:spacing w:after="60" w:before="200"/>
+        <w:jc w:val="left"/>
+      </w:pPr>
+      <w:r>
+        <w:rPr>
+          <w:rFonts w:ascii="Calibri" w:cs="Calibri" w:eastAsia="Calibri" w:hAnsi="Calibri"/>
+          <w:b/>
+          <w:bCs/>
+          <w:sz w:val="19"/>
+          <w:szCs w:val="19"/>
+        </w:rPr>
+        <w:t xml:space="preserve">Table 2. </w:t>
+      </w:r>
+      <w:r>
+        <w:rPr>
+          <w:rFonts w:ascii="Calibri" w:cs="Calibri" w:eastAsia="Calibri" w:hAnsi="Calibri"/>
+          <w:sz w:val="19"/>
+          <w:szCs w:val="19"/>
+        </w:rPr>
+        <w:t xml:space="preserve">Spearman-rank tornado of FIRR variance drivers (20,000-draw Monte Carlo).</w:t>
+      </w:r>
+    </w:p>
+    <w:tbl>
+      <w:tblPr>
+        <w:tblW w:type="pct" w:w="100%"/>
+        <w:tblBorders>
+          <w:top w:val="single" w:color="1F3864" w:sz="4"/>
+          <w:left w:val="none"/>
+          <w:bottom w:val="single" w:color="1F3864" w:sz="4"/>
+          <w:right w:val="none"/>
+          <w:insideH w:val="single" w:color="BFBFBF" w:sz="2"/>
+          <w:insideV w:val="none"/>
+        </w:tblBorders>
+      </w:tblPr>
+      <w:tblGrid>
+        <w:gridCol w:w="100"/>
+        <w:gridCol w:w="100"/>
+        <w:gridCol w:w="100"/>
+      </w:tblGrid>
+      <w:tr>
+        <w:trPr>
+          <w:tblHeader/>
+        </w:trPr>
+        <w:tc>
+          <w:tcPr>
+            <w:shd w:fill="1F3864" w:val="clear"/>
+            <w:tcMar>
+              <w:top w:type="dxa" w:w="40"/>
+              <w:left w:type="dxa" w:w="80"/>
+              <w:bottom w:type="dxa" w:w="40"/>
+              <w:right w:type="dxa" w:w="80"/>
+            </w:tcMar>
+          </w:tcPr>
+          <w:p>
+            <w:r>
+              <w:rPr>
+                <w:rFonts w:ascii="Times New Roman" w:cs="Times New Roman" w:eastAsia="Times New Roman" w:hAnsi="Times New Roman"/>
+                <w:b/>
+                <w:bCs/>
+                <w:color w:val="FFFFFF"/>
+                <w:sz w:val="18"/>
+                <w:szCs w:val="18"/>
+              </w:rPr>
+              <w:t xml:space="preserve">Driver</w:t>
+            </w:r>
+          </w:p>
+        </w:tc>
+        <w:tc>
+          <w:tcPr>
+            <w:shd w:fill="1F3864" w:val="clear"/>
+            <w:tcMar>
+              <w:top w:type="dxa" w:w="40"/>
+              <w:left w:type="dxa" w:w="80"/>
+              <w:bottom w:type="dxa" w:w="40"/>
+              <w:right w:type="dxa" w:w="80"/>
+            </w:tcMar>
+          </w:tcPr>
+          <w:p>
+            <w:r>
+              <w:rPr>
+                <w:rFonts w:ascii="Times New Roman" w:cs="Times New Roman" w:eastAsia="Times New Roman" w:hAnsi="Times New Roman"/>
+                <w:b/>
+                <w:bCs/>
+                <w:color w:val="FFFFFF"/>
+                <w:sz w:val="18"/>
+                <w:szCs w:val="18"/>
+              </w:rPr>
+              <w:t xml:space="preserve">Spearman ρ</w:t>
+            </w:r>
+          </w:p>
+        </w:tc>
+        <w:tc>
+          <w:tcPr>
+            <w:shd w:fill="1F3864" w:val="clear"/>
+            <w:tcMar>
+              <w:top w:type="dxa" w:w="40"/>
+              <w:left w:type="dxa" w:w="80"/>
+              <w:bottom w:type="dxa" w:w="40"/>
+              <w:right w:type="dxa" w:w="80"/>
+            </w:tcMar>
+          </w:tcPr>
+          <w:p>
+            <w:r>
+              <w:rPr>
+                <w:rFonts w:ascii="Times New Roman" w:cs="Times New Roman" w:eastAsia="Times New Roman" w:hAnsi="Times New Roman"/>
+                <w:b/>
+                <w:bCs/>
+                <w:color w:val="FFFFFF"/>
+                <w:sz w:val="18"/>
+                <w:szCs w:val="18"/>
+              </w:rPr>
+              <w:t xml:space="preserve">Variance contribution</w:t>
+            </w:r>
+          </w:p>
+        </w:tc>
+      </w:tr>
+      <w:tr>
+        <w:tc>
+          <w:tcPr>
+            <w:tcMar>
+              <w:top w:type="dxa" w:w="40"/>
+              <w:left w:type="dxa" w:w="80"/>
+              <w:bottom w:type="dxa" w:w="40"/>
+              <w:right w:type="dxa" w:w="80"/>
+            </w:tcMar>
+          </w:tcPr>
+          <w:p>
+            <w:r>
+              <w:rPr>
+                <w:rFonts w:ascii="Times New Roman" w:cs="Times New Roman" w:eastAsia="Times New Roman" w:hAnsi="Times New Roman"/>
+                <w:sz w:val="18"/>
+                <w:szCs w:val="18"/>
+              </w:rPr>
+              <w:t xml:space="preserve">Ridership multiplier</w:t>
+            </w:r>
+          </w:p>
+        </w:tc>
+        <w:tc>
+          <w:tcPr>
+            <w:tcMar>
+              <w:top w:type="dxa" w:w="40"/>
+              <w:left w:type="dxa" w:w="80"/>
+              <w:bottom w:type="dxa" w:w="40"/>
+              <w:right w:type="dxa" w:w="80"/>
+            </w:tcMar>
+          </w:tcPr>
+          <w:p>
+            <w:r>
+              <w:rPr>
+                <w:rFonts w:ascii="Times New Roman" w:cs="Times New Roman" w:eastAsia="Times New Roman" w:hAnsi="Times New Roman"/>
+                <w:sz w:val="18"/>
+                <w:szCs w:val="18"/>
+              </w:rPr>
+              <w:t xml:space="preserve">0.514</w:t>
+            </w:r>
+          </w:p>
+        </w:tc>
+        <w:tc>
+          <w:tcPr>
+            <w:tcMar>
+              <w:top w:type="dxa" w:w="40"/>
+              <w:left w:type="dxa" w:w="80"/>
+              <w:bottom w:type="dxa" w:w="40"/>
+              <w:right w:type="dxa" w:w="80"/>
+            </w:tcMar>
+          </w:tcPr>
+          <w:p>
+            <w:r>
+              <w:rPr>
+                <w:rFonts w:ascii="Times New Roman" w:cs="Times New Roman" w:eastAsia="Times New Roman" w:hAnsi="Times New Roman"/>
+                <w:sz w:val="18"/>
+                <w:szCs w:val="18"/>
+              </w:rPr>
+              <w:t xml:space="preserve">20.7%</w:t>
+            </w:r>
+          </w:p>
+        </w:tc>
+      </w:tr>
+      <w:tr>
+        <w:tc>
+          <w:tcPr>
+            <w:shd w:fill="EFF2F7" w:val="clear"/>
+            <w:tcMar>
+              <w:top w:type="dxa" w:w="40"/>
+              <w:left w:type="dxa" w:w="80"/>
+              <w:bottom w:type="dxa" w:w="40"/>
+              <w:right w:type="dxa" w:w="80"/>
+            </w:tcMar>
+          </w:tcPr>
+          <w:p>
+            <w:r>
+              <w:rPr>
+                <w:rFonts w:ascii="Times New Roman" w:cs="Times New Roman" w:eastAsia="Times New Roman" w:hAnsi="Times New Roman"/>
+                <w:sz w:val="18"/>
+                <w:szCs w:val="18"/>
+              </w:rPr>
+              <w:t xml:space="preserve">Average trip length</w:t>
+            </w:r>
+          </w:p>
+        </w:tc>
+        <w:tc>
+          <w:tcPr>
+            <w:shd w:fill="EFF2F7" w:val="clear"/>
+            <w:tcMar>
+              <w:top w:type="dxa" w:w="40"/>
+              <w:left w:type="dxa" w:w="80"/>
+              <w:bottom w:type="dxa" w:w="40"/>
+              <w:right w:type="dxa" w:w="80"/>
+            </w:tcMar>
+          </w:tcPr>
+          <w:p>
+            <w:r>
+              <w:rPr>
+                <w:rFonts w:ascii="Times New Roman" w:cs="Times New Roman" w:eastAsia="Times New Roman" w:hAnsi="Times New Roman"/>
+                <w:sz w:val="18"/>
+                <w:szCs w:val="18"/>
+              </w:rPr>
+              <w:t xml:space="preserve">0.433</w:t>
+            </w:r>
+          </w:p>
+        </w:tc>
+        <w:tc>
+          <w:tcPr>
+            <w:shd w:fill="EFF2F7" w:val="clear"/>
+            <w:tcMar>
+              <w:top w:type="dxa" w:w="40"/>
+              <w:left w:type="dxa" w:w="80"/>
+              <w:bottom w:type="dxa" w:w="40"/>
+              <w:right w:type="dxa" w:w="80"/>
+            </w:tcMar>
+          </w:tcPr>
+          <w:p>
+            <w:r>
+              <w:rPr>
+                <w:rFonts w:ascii="Times New Roman" w:cs="Times New Roman" w:eastAsia="Times New Roman" w:hAnsi="Times New Roman"/>
+                <w:sz w:val="18"/>
+                <w:szCs w:val="18"/>
+              </w:rPr>
+              <w:t xml:space="preserve">17.5%</w:t>
+            </w:r>
+          </w:p>
+        </w:tc>
+      </w:tr>
+      <w:tr>
+        <w:tc>
+          <w:tcPr>
+            <w:tcMar>
+              <w:top w:type="dxa" w:w="40"/>
+              <w:left w:type="dxa" w:w="80"/>
+              <w:bottom w:type="dxa" w:w="40"/>
+              <w:right w:type="dxa" w:w="80"/>
+            </w:tcMar>
+          </w:tcPr>
+          <w:p>
+            <w:r>
+              <w:rPr>
+                <w:rFonts w:ascii="Times New Roman" w:cs="Times New Roman" w:eastAsia="Times New Roman" w:hAnsi="Times New Roman"/>
+                <w:sz w:val="18"/>
+                <w:szCs w:val="18"/>
+              </w:rPr>
+              <w:t xml:space="preserve">Capital-cost multiplier</w:t>
+            </w:r>
+          </w:p>
+        </w:tc>
+        <w:tc>
+          <w:tcPr>
+            <w:tcMar>
+              <w:top w:type="dxa" w:w="40"/>
+              <w:left w:type="dxa" w:w="80"/>
+              <w:bottom w:type="dxa" w:w="40"/>
+              <w:right w:type="dxa" w:w="80"/>
+            </w:tcMar>
+          </w:tcPr>
+          <w:p>
+            <w:r>
+              <w:rPr>
+                <w:rFonts w:ascii="Times New Roman" w:cs="Times New Roman" w:eastAsia="Times New Roman" w:hAnsi="Times New Roman"/>
+                <w:sz w:val="18"/>
+                <w:szCs w:val="18"/>
+              </w:rPr>
+              <w:t xml:space="preserve">−0.408</w:t>
+            </w:r>
+          </w:p>
+        </w:tc>
+        <w:tc>
+          <w:tcPr>
+            <w:tcMar>
+              <w:top w:type="dxa" w:w="40"/>
+              <w:left w:type="dxa" w:w="80"/>
+              <w:bottom w:type="dxa" w:w="40"/>
+              <w:right w:type="dxa" w:w="80"/>
+            </w:tcMar>
+          </w:tcPr>
+          <w:p>
+            <w:r>
+              <w:rPr>
+                <w:rFonts w:ascii="Times New Roman" w:cs="Times New Roman" w:eastAsia="Times New Roman" w:hAnsi="Times New Roman"/>
+                <w:sz w:val="18"/>
+                <w:szCs w:val="18"/>
+              </w:rPr>
+              <w:t xml:space="preserve">16.5%</w:t>
+            </w:r>
+          </w:p>
+        </w:tc>
+      </w:tr>
+      <w:tr>
+        <w:tc>
+          <w:tcPr>
+            <w:shd w:fill="EFF2F7" w:val="clear"/>
+            <w:tcMar>
+              <w:top w:type="dxa" w:w="40"/>
+              <w:left w:type="dxa" w:w="80"/>
+              <w:bottom w:type="dxa" w:w="40"/>
+              <w:right w:type="dxa" w:w="80"/>
+            </w:tcMar>
+          </w:tcPr>
+          <w:p>
+            <w:r>
+              <w:rPr>
+                <w:rFonts w:ascii="Times New Roman" w:cs="Times New Roman" w:eastAsia="Times New Roman" w:hAnsi="Times New Roman"/>
+                <w:sz w:val="18"/>
+                <w:szCs w:val="18"/>
+              </w:rPr>
+              <w:t xml:space="preserve">Salvage value</w:t>
+            </w:r>
+          </w:p>
+        </w:tc>
+        <w:tc>
+          <w:tcPr>
+            <w:shd w:fill="EFF2F7" w:val="clear"/>
+            <w:tcMar>
+              <w:top w:type="dxa" w:w="40"/>
+              <w:left w:type="dxa" w:w="80"/>
+              <w:bottom w:type="dxa" w:w="40"/>
+              <w:right w:type="dxa" w:w="80"/>
+            </w:tcMar>
+          </w:tcPr>
+          <w:p>
+            <w:r>
+              <w:rPr>
+                <w:rFonts w:ascii="Times New Roman" w:cs="Times New Roman" w:eastAsia="Times New Roman" w:hAnsi="Times New Roman"/>
+                <w:sz w:val="18"/>
+                <w:szCs w:val="18"/>
+              </w:rPr>
+              <w:t xml:space="preserve">0.314</w:t>
+            </w:r>
+          </w:p>
+        </w:tc>
+        <w:tc>
+          <w:tcPr>
+            <w:shd w:fill="EFF2F7" w:val="clear"/>
+            <w:tcMar>
+              <w:top w:type="dxa" w:w="40"/>
+              <w:left w:type="dxa" w:w="80"/>
+              <w:bottom w:type="dxa" w:w="40"/>
+              <w:right w:type="dxa" w:w="80"/>
+            </w:tcMar>
+          </w:tcPr>
+          <w:p>
+            <w:r>
+              <w:rPr>
+                <w:rFonts w:ascii="Times New Roman" w:cs="Times New Roman" w:eastAsia="Times New Roman" w:hAnsi="Times New Roman"/>
+                <w:sz w:val="18"/>
+                <w:szCs w:val="18"/>
+              </w:rPr>
+              <w:t xml:space="preserve">12.6%</w:t>
+            </w:r>
+          </w:p>
+        </w:tc>
+      </w:tr>
+      <w:tr>
+        <w:tc>
+          <w:tcPr>
+            <w:tcMar>
+              <w:top w:type="dxa" w:w="40"/>
+              <w:left w:type="dxa" w:w="80"/>
+              <w:bottom w:type="dxa" w:w="40"/>
+              <w:right w:type="dxa" w:w="80"/>
+            </w:tcMar>
+          </w:tcPr>
+          <w:p>
+            <w:r>
+              <w:rPr>
+                <w:rFonts w:ascii="Times New Roman" w:cs="Times New Roman" w:eastAsia="Times New Roman" w:hAnsi="Times New Roman"/>
+                <w:sz w:val="18"/>
+                <w:szCs w:val="18"/>
+              </w:rPr>
+              <w:t xml:space="preserve">EBITDA margin</w:t>
+            </w:r>
+          </w:p>
+        </w:tc>
+        <w:tc>
+          <w:tcPr>
+            <w:tcMar>
+              <w:top w:type="dxa" w:w="40"/>
+              <w:left w:type="dxa" w:w="80"/>
+              <w:bottom w:type="dxa" w:w="40"/>
+              <w:right w:type="dxa" w:w="80"/>
+            </w:tcMar>
+          </w:tcPr>
+          <w:p>
+            <w:r>
+              <w:rPr>
+                <w:rFonts w:ascii="Times New Roman" w:cs="Times New Roman" w:eastAsia="Times New Roman" w:hAnsi="Times New Roman"/>
+                <w:sz w:val="18"/>
+                <w:szCs w:val="18"/>
+              </w:rPr>
+              <w:t xml:space="preserve">0.306</w:t>
+            </w:r>
+          </w:p>
+        </w:tc>
+        <w:tc>
+          <w:tcPr>
+            <w:tcMar>
+              <w:top w:type="dxa" w:w="40"/>
+              <w:left w:type="dxa" w:w="80"/>
+              <w:bottom w:type="dxa" w:w="40"/>
+              <w:right w:type="dxa" w:w="80"/>
+            </w:tcMar>
+          </w:tcPr>
+          <w:p>
+            <w:r>
+              <w:rPr>
+                <w:rFonts w:ascii="Times New Roman" w:cs="Times New Roman" w:eastAsia="Times New Roman" w:hAnsi="Times New Roman"/>
+                <w:sz w:val="18"/>
+                <w:szCs w:val="18"/>
+              </w:rPr>
+              <w:t xml:space="preserve">12.3%</w:t>
+            </w:r>
+          </w:p>
+        </w:tc>
+      </w:tr>
+      <w:tr>
+        <w:tc>
+          <w:tcPr>
+            <w:shd w:fill="EFF2F7" w:val="clear"/>
+            <w:tcMar>
+              <w:top w:type="dxa" w:w="40"/>
+              <w:left w:type="dxa" w:w="80"/>
+              <w:bottom w:type="dxa" w:w="40"/>
+              <w:right w:type="dxa" w:w="80"/>
+            </w:tcMar>
+          </w:tcPr>
+          <w:p>
+            <w:r>
+              <w:rPr>
+                <w:rFonts w:ascii="Times New Roman" w:cs="Times New Roman" w:eastAsia="Times New Roman" w:hAnsi="Times New Roman"/>
+                <w:sz w:val="18"/>
+                <w:szCs w:val="18"/>
+              </w:rPr>
+              <w:t xml:space="preserve">Fare</w:t>
+            </w:r>
+          </w:p>
+        </w:tc>
+        <w:tc>
+          <w:tcPr>
+            <w:shd w:fill="EFF2F7" w:val="clear"/>
+            <w:tcMar>
+              <w:top w:type="dxa" w:w="40"/>
+              <w:left w:type="dxa" w:w="80"/>
+              <w:bottom w:type="dxa" w:w="40"/>
+              <w:right w:type="dxa" w:w="80"/>
+            </w:tcMar>
+          </w:tcPr>
+          <w:p>
+            <w:r>
+              <w:rPr>
+                <w:rFonts w:ascii="Times New Roman" w:cs="Times New Roman" w:eastAsia="Times New Roman" w:hAnsi="Times New Roman"/>
+                <w:sz w:val="18"/>
+                <w:szCs w:val="18"/>
+              </w:rPr>
+              <w:t xml:space="preserve">0.256</w:t>
+            </w:r>
+          </w:p>
+        </w:tc>
+        <w:tc>
+          <w:tcPr>
+            <w:shd w:fill="EFF2F7" w:val="clear"/>
+            <w:tcMar>
+              <w:top w:type="dxa" w:w="40"/>
+              <w:left w:type="dxa" w:w="80"/>
+              <w:bottom w:type="dxa" w:w="40"/>
+              <w:right w:type="dxa" w:w="80"/>
+            </w:tcMar>
+          </w:tcPr>
+          <w:p>
+            <w:r>
+              <w:rPr>
+                <w:rFonts w:ascii="Times New Roman" w:cs="Times New Roman" w:eastAsia="Times New Roman" w:hAnsi="Times New Roman"/>
+                <w:sz w:val="18"/>
+                <w:szCs w:val="18"/>
+              </w:rPr>
+              <w:t xml:space="preserve">10.3%</w:t>
+            </w:r>
+          </w:p>
+        </w:tc>
+      </w:tr>
+      <w:tr>
+        <w:tc>
+          <w:tcPr>
+            <w:tcMar>
+              <w:top w:type="dxa" w:w="40"/>
+              <w:left w:type="dxa" w:w="80"/>
+              <w:bottom w:type="dxa" w:w="40"/>
+              <w:right w:type="dxa" w:w="80"/>
+            </w:tcMar>
+          </w:tcPr>
+          <w:p>
+            <w:r>
+              <w:rPr>
+                <w:rFonts w:ascii="Times New Roman" w:cs="Times New Roman" w:eastAsia="Times New Roman" w:hAnsi="Times New Roman"/>
+                <w:sz w:val="18"/>
+                <w:szCs w:val="18"/>
+              </w:rPr>
+              <w:t xml:space="preserve">Post-2031 growth</w:t>
+            </w:r>
+          </w:p>
+        </w:tc>
+        <w:tc>
+          <w:tcPr>
+            <w:tcMar>
+              <w:top w:type="dxa" w:w="40"/>
+              <w:left w:type="dxa" w:w="80"/>
+              <w:bottom w:type="dxa" w:w="40"/>
+              <w:right w:type="dxa" w:w="80"/>
+            </w:tcMar>
+          </w:tcPr>
+          <w:p>
+            <w:r>
+              <w:rPr>
+                <w:rFonts w:ascii="Times New Roman" w:cs="Times New Roman" w:eastAsia="Times New Roman" w:hAnsi="Times New Roman"/>
+                <w:sz w:val="18"/>
+                <w:szCs w:val="18"/>
+              </w:rPr>
+              <w:t xml:space="preserve">0.249</w:t>
+            </w:r>
+          </w:p>
+        </w:tc>
+        <w:tc>
+          <w:tcPr>
+            <w:tcMar>
+              <w:top w:type="dxa" w:w="40"/>
+              <w:left w:type="dxa" w:w="80"/>
+              <w:bottom w:type="dxa" w:w="40"/>
+              <w:right w:type="dxa" w:w="80"/>
+            </w:tcMar>
+          </w:tcPr>
+          <w:p>
+            <w:r>
+              <w:rPr>
+                <w:rFonts w:ascii="Times New Roman" w:cs="Times New Roman" w:eastAsia="Times New Roman" w:hAnsi="Times New Roman"/>
+                <w:sz w:val="18"/>
+                <w:szCs w:val="18"/>
+              </w:rPr>
+              <w:t xml:space="preserve">10.0%</w:t>
+            </w:r>
+          </w:p>
+        </w:tc>
+      </w:tr>
+    </w:tbl>
+    <w:p>
+      <w:pPr>
+        <w:spacing w:after="160"/>
+      </w:pPr>
+      <w:r>
+        <w:rPr>
+          <w:rFonts w:ascii="Times New Roman" w:cs="Times New Roman" w:eastAsia="Times New Roman" w:hAnsi="Times New Roman"/>
+          <w:i/>
+          <w:iCs/>
+          <w:sz w:val="16"/>
+          <w:szCs w:val="16"/>
+        </w:rPr>
+        <w:t xml:space="preserve">Source: data/processed/firr_tornado.csv.</w:t>
+      </w:r>
+    </w:p>
+    <w:p>
+      <w:pPr>
+        <w:spacing w:after="60" w:before="120"/>
+        <w:jc w:val="center"/>
+      </w:pPr>
+      <w:r>
+        <w:drawing>
+          <wp:inline distT="0" distB="0" distL="0" distR="0">
+            <wp:extent cx="4953000" cy="3095625"/>
+            <wp:effectExtent t="0" r="0" b="0" l="0"/>
+            <wp:docPr id="1" name="" descr="" title=""/>
+            <wp:cNvGraphicFramePr>
+              <a:graphicFrameLocks xmlns:a="http://schemas.openxmlformats.org/drawingml/2006/main" noChangeAspect="1"/>
+            </wp:cNvGraphicFramePr>
+            <a:graphic xmlns:a="http://schemas.openxmlformats.org/drawingml/2006/main">
+              <a:graphicData uri="http://schemas.openxmlformats.org/drawingml/2006/picture">
+                <pic:pic xmlns:pic="http://schemas.openxmlformats.org/drawingml/2006/picture">
+                  <pic:nvPicPr>
+                    <pic:cNvPr id="0" name="" descr=""/>
+                    <pic:cNvPicPr>
+                      <a:picLocks noChangeAspect="1" noChangeArrowheads="1"/>
+                    </pic:cNvPicPr>
+                  </pic:nvPicPr>
+                  <pic:blipFill>
+                    <a:blip r:embed="rId13" cstate="none"/>
+                    <a:srcRect/>
+                    <a:stretch>
+                      <a:fillRect/>
+                    </a:stretch>
+                  </pic:blipFill>
+                  <pic:spPr bwMode="auto">
+                    <a:xfrm>
+                      <a:off x="0" y="0"/>
                       <a:ext cx="4953000" cy="3095625"/>
                     </a:xfrm>
                     <a:prstGeom prst="rect">
@@ -2053,7 +2303,7 @@
           <w:sz w:val="18"/>
           <w:szCs w:val="18"/>
         </w:rPr>
-        <w:t xml:space="preserve">Figure 4. </w:t>
+        <w:t xml:space="preserve">Figure 6. </w:t>
       </w:r>
       <w:r>
         <w:rPr>
@@ -2063,7 +2313,79 @@
           <w:sz w:val="18"/>
           <w:szCs w:val="18"/>
         </w:rPr>
-        <w:t xml:space="preserve">FIRR sensitivity tornado: change in FIRR (percentage points) versus the ADB base, by scenario.</w:t>
+        <w:t xml:space="preserve">Spearman-rank tornado of FIRR variance drivers: ridership 20.7%, trip length 17.5%, capital cost 16.5%, salvage 12.6%, EBITDA margin 12.3%, fare 10.3%, growth 10.0%. notebooks/03_montecarlo_firr.py.</w:t>
+      </w:r>
+    </w:p>
+    <w:p>
+      <w:pPr>
+        <w:spacing w:after="60" w:before="120"/>
+        <w:jc w:val="center"/>
+      </w:pPr>
+      <w:r>
+        <w:drawing>
+          <wp:inline distT="0" distB="0" distL="0" distR="0">
+            <wp:extent cx="4953000" cy="3095625"/>
+            <wp:effectExtent t="0" r="0" b="0" l="0"/>
+            <wp:docPr id="1" name="" descr="" title=""/>
+            <wp:cNvGraphicFramePr>
+              <a:graphicFrameLocks xmlns:a="http://schemas.openxmlformats.org/drawingml/2006/main" noChangeAspect="1"/>
+            </wp:cNvGraphicFramePr>
+            <a:graphic xmlns:a="http://schemas.openxmlformats.org/drawingml/2006/main">
+              <a:graphicData uri="http://schemas.openxmlformats.org/drawingml/2006/picture">
+                <pic:pic xmlns:pic="http://schemas.openxmlformats.org/drawingml/2006/picture">
+                  <pic:nvPicPr>
+                    <pic:cNvPr id="0" name="" descr=""/>
+                    <pic:cNvPicPr>
+                      <a:picLocks noChangeAspect="1" noChangeArrowheads="1"/>
+                    </pic:cNvPicPr>
+                  </pic:nvPicPr>
+                  <pic:blipFill>
+                    <a:blip r:embed="rId14" cstate="none"/>
+                    <a:srcRect/>
+                    <a:stretch>
+                      <a:fillRect/>
+                    </a:stretch>
+                  </pic:blipFill>
+                  <pic:spPr bwMode="auto">
+                    <a:xfrm>
+                      <a:off x="0" y="0"/>
+                      <a:ext cx="4953000" cy="3095625"/>
+                    </a:xfrm>
+                    <a:prstGeom prst="rect">
+                      <a:avLst/>
+                    </a:prstGeom>
+                  </pic:spPr>
+                </pic:pic>
+              </a:graphicData>
+            </a:graphic>
+          </wp:inline>
+        </w:drawing>
+      </w:r>
+    </w:p>
+    <w:p>
+      <w:pPr>
+        <w:spacing w:after="200"/>
+        <w:jc w:val="center"/>
+      </w:pPr>
+      <w:r>
+        <w:rPr>
+          <w:rFonts w:ascii="Calibri" w:cs="Calibri" w:eastAsia="Calibri" w:hAnsi="Calibri"/>
+          <w:b/>
+          <w:bCs/>
+          <w:sz w:val="18"/>
+          <w:szCs w:val="18"/>
+        </w:rPr>
+        <w:t xml:space="preserve">Figure 4. </w:t>
+      </w:r>
+      <w:r>
+        <w:rPr>
+          <w:rFonts w:ascii="Calibri" w:cs="Calibri" w:eastAsia="Calibri" w:hAnsi="Calibri"/>
+          <w:i/>
+          <w:iCs/>
+          <w:sz w:val="18"/>
+          <w:szCs w:val="18"/>
+        </w:rPr>
+        <w:t xml:space="preserve">One-at-a-time FIRR sensitivity tornado: change in FIRR (percentage points) versus the ADB base, by assumption shock. notebooks/02_firr_wacc_forecast.py.</w:t>
       </w:r>
     </w:p>
     <w:p>
@@ -2081,7 +2403,7 @@
           <w:sz w:val="22"/>
           <w:szCs w:val="22"/>
         </w:rPr>
-        <w:t xml:space="preserve">5.4. Why PRR may be the better tokenization candidate</w:t>
+        <w:t xml:space="preserve">5.4. What tokenization would actually have to deliver</w:t>
       </w:r>
     </w:p>
     <w:p>
@@ -2095,7 +2417,846 @@
           <w:sz w:val="21"/>
           <w:szCs w:val="21"/>
         </w:rPr>
-        <w:t xml:space="preserve">The metro’s cost of capital is already extraordinarily low because of concessional sovereign debt; there is little room for tokenized equity to undercut a 0% real JICA loan. The PRR/BBC is different. Its dominant cost is land acquisition (~₹21,000 crore of ~₹27,000 crore), it is financed substantially through HUDCO borrowing, and a betterment-levy or land-value-capture structure maps naturally onto a tokenized unit backed by toll and monetized-land cash flows. We cannot complete the PRR viability arithmetic — no primary DPR is public — but the structure of its cost base is where a T-InvIT’s access and pricing advantages would bite hardest.</w:t>
+        <w:t xml:space="preserve">Tokenization’s mechanism is not higher ridership or lower construction cost — it cannot change those — but a lower cost of equity, achieved by widening the investor base. We therefore sweep the equity cost downward and recompute the WACC at each step, holding equity’s 55.66% weight fixed (Table 3, data/processed/tokenization_coe_sweep.csv). The viability gap closes only at roughly a 130-basis-point reduction in the cost of equity: at a 120 bp cut the gap is still −0.04 pp, and it first turns positive (+0.02 pp) at 130 bp. This is a demanding bar. A 130 bp compression of the equity cost of capital is plausible in principle if tokenization genuinely broadens demand and reduces the illiquidity premium investors require, but it is not a foregone conclusion, and the modest, imprecisely-estimated liquidity gains documented in the companion empirical study (Sandeep, 2025) counsel caution. Figure 7 plots the break-even sweep; Figure 8 shows the two-way sensitivity surface of FIRR over the ridership and cost multipliers, making visible the region of the assumption space in which the project clears WACC.</w:t>
+      </w:r>
+    </w:p>
+    <w:p>
+      <w:pPr>
+        <w:spacing w:after="60" w:before="200"/>
+        <w:jc w:val="left"/>
+      </w:pPr>
+      <w:r>
+        <w:rPr>
+          <w:rFonts w:ascii="Calibri" w:cs="Calibri" w:eastAsia="Calibri" w:hAnsi="Calibri"/>
+          <w:b/>
+          <w:bCs/>
+          <w:sz w:val="19"/>
+          <w:szCs w:val="19"/>
+        </w:rPr>
+        <w:t xml:space="preserve">Table 3. </w:t>
+      </w:r>
+      <w:r>
+        <w:rPr>
+          <w:rFonts w:ascii="Calibri" w:cs="Calibri" w:eastAsia="Calibri" w:hAnsi="Calibri"/>
+          <w:sz w:val="19"/>
+          <w:szCs w:val="19"/>
+        </w:rPr>
+        <w:t xml:space="preserve">Cost-of-equity break-even sweep: viability gap as the equity cost falls (equity weight 55.66% fixed).</w:t>
+      </w:r>
+    </w:p>
+    <w:tbl>
+      <w:tblPr>
+        <w:tblW w:type="pct" w:w="100%"/>
+        <w:tblBorders>
+          <w:top w:val="single" w:color="1F3864" w:sz="4"/>
+          <w:left w:val="none"/>
+          <w:bottom w:val="single" w:color="1F3864" w:sz="4"/>
+          <w:right w:val="none"/>
+          <w:insideH w:val="single" w:color="BFBFBF" w:sz="2"/>
+          <w:insideV w:val="none"/>
+        </w:tblBorders>
+      </w:tblPr>
+      <w:tblGrid>
+        <w:gridCol w:w="100"/>
+        <w:gridCol w:w="100"/>
+        <w:gridCol w:w="100"/>
+        <w:gridCol w:w="100"/>
+      </w:tblGrid>
+      <w:tr>
+        <w:trPr>
+          <w:tblHeader/>
+        </w:trPr>
+        <w:tc>
+          <w:tcPr>
+            <w:shd w:fill="1F3864" w:val="clear"/>
+            <w:tcMar>
+              <w:top w:type="dxa" w:w="40"/>
+              <w:left w:type="dxa" w:w="80"/>
+              <w:bottom w:type="dxa" w:w="40"/>
+              <w:right w:type="dxa" w:w="80"/>
+            </w:tcMar>
+          </w:tcPr>
+          <w:p>
+            <w:r>
+              <w:rPr>
+                <w:rFonts w:ascii="Times New Roman" w:cs="Times New Roman" w:eastAsia="Times New Roman" w:hAnsi="Times New Roman"/>
+                <w:b/>
+                <w:bCs/>
+                <w:color w:val="FFFFFF"/>
+                <w:sz w:val="18"/>
+                <w:szCs w:val="18"/>
+              </w:rPr>
+              <w:t xml:space="preserve">CoE reduction (bp)</w:t>
+            </w:r>
+          </w:p>
+        </w:tc>
+        <w:tc>
+          <w:tcPr>
+            <w:shd w:fill="1F3864" w:val="clear"/>
+            <w:tcMar>
+              <w:top w:type="dxa" w:w="40"/>
+              <w:left w:type="dxa" w:w="80"/>
+              <w:bottom w:type="dxa" w:w="40"/>
+              <w:right w:type="dxa" w:w="80"/>
+            </w:tcMar>
+          </w:tcPr>
+          <w:p>
+            <w:r>
+              <w:rPr>
+                <w:rFonts w:ascii="Times New Roman" w:cs="Times New Roman" w:eastAsia="Times New Roman" w:hAnsi="Times New Roman"/>
+                <w:b/>
+                <w:bCs/>
+                <w:color w:val="FFFFFF"/>
+                <w:sz w:val="18"/>
+                <w:szCs w:val="18"/>
+              </w:rPr>
+              <w:t xml:space="preserve">Recomputed WACC</w:t>
+            </w:r>
+          </w:p>
+        </w:tc>
+        <w:tc>
+          <w:tcPr>
+            <w:shd w:fill="1F3864" w:val="clear"/>
+            <w:tcMar>
+              <w:top w:type="dxa" w:w="40"/>
+              <w:left w:type="dxa" w:w="80"/>
+              <w:bottom w:type="dxa" w:w="40"/>
+              <w:right w:type="dxa" w:w="80"/>
+            </w:tcMar>
+          </w:tcPr>
+          <w:p>
+            <w:r>
+              <w:rPr>
+                <w:rFonts w:ascii="Times New Roman" w:cs="Times New Roman" w:eastAsia="Times New Roman" w:hAnsi="Times New Roman"/>
+                <w:b/>
+                <w:bCs/>
+                <w:color w:val="FFFFFF"/>
+                <w:sz w:val="18"/>
+                <w:szCs w:val="18"/>
+              </w:rPr>
+              <w:t xml:space="preserve">Viability gap (pp)</w:t>
+            </w:r>
+          </w:p>
+        </w:tc>
+        <w:tc>
+          <w:tcPr>
+            <w:shd w:fill="1F3864" w:val="clear"/>
+            <w:tcMar>
+              <w:top w:type="dxa" w:w="40"/>
+              <w:left w:type="dxa" w:w="80"/>
+              <w:bottom w:type="dxa" w:w="40"/>
+              <w:right w:type="dxa" w:w="80"/>
+            </w:tcMar>
+          </w:tcPr>
+          <w:p>
+            <w:r>
+              <w:rPr>
+                <w:rFonts w:ascii="Times New Roman" w:cs="Times New Roman" w:eastAsia="Times New Roman" w:hAnsi="Times New Roman"/>
+                <w:b/>
+                <w:bCs/>
+                <w:color w:val="FFFFFF"/>
+                <w:sz w:val="18"/>
+                <w:szCs w:val="18"/>
+              </w:rPr>
+              <w:t xml:space="preserve">Viable?</w:t>
+            </w:r>
+          </w:p>
+        </w:tc>
+      </w:tr>
+      <w:tr>
+        <w:tc>
+          <w:tcPr>
+            <w:tcMar>
+              <w:top w:type="dxa" w:w="40"/>
+              <w:left w:type="dxa" w:w="80"/>
+              <w:bottom w:type="dxa" w:w="40"/>
+              <w:right w:type="dxa" w:w="80"/>
+            </w:tcMar>
+          </w:tcPr>
+          <w:p>
+            <w:r>
+              <w:rPr>
+                <w:rFonts w:ascii="Times New Roman" w:cs="Times New Roman" w:eastAsia="Times New Roman" w:hAnsi="Times New Roman"/>
+                <w:sz w:val="18"/>
+                <w:szCs w:val="18"/>
+              </w:rPr>
+              <w:t xml:space="preserve">0</w:t>
+            </w:r>
+          </w:p>
+        </w:tc>
+        <w:tc>
+          <w:tcPr>
+            <w:tcMar>
+              <w:top w:type="dxa" w:w="40"/>
+              <w:left w:type="dxa" w:w="80"/>
+              <w:bottom w:type="dxa" w:w="40"/>
+              <w:right w:type="dxa" w:w="80"/>
+            </w:tcMar>
+          </w:tcPr>
+          <w:p>
+            <w:r>
+              <w:rPr>
+                <w:rFonts w:ascii="Times New Roman" w:cs="Times New Roman" w:eastAsia="Times New Roman" w:hAnsi="Times New Roman"/>
+                <w:sz w:val="18"/>
+                <w:szCs w:val="18"/>
+              </w:rPr>
+              <w:t xml:space="preserve">2.629%</w:t>
+            </w:r>
+          </w:p>
+        </w:tc>
+        <w:tc>
+          <w:tcPr>
+            <w:tcMar>
+              <w:top w:type="dxa" w:w="40"/>
+              <w:left w:type="dxa" w:w="80"/>
+              <w:bottom w:type="dxa" w:w="40"/>
+              <w:right w:type="dxa" w:w="80"/>
+            </w:tcMar>
+          </w:tcPr>
+          <w:p>
+            <w:r>
+              <w:rPr>
+                <w:rFonts w:ascii="Times New Roman" w:cs="Times New Roman" w:eastAsia="Times New Roman" w:hAnsi="Times New Roman"/>
+                <w:sz w:val="18"/>
+                <w:szCs w:val="18"/>
+              </w:rPr>
+              <w:t xml:space="preserve">−0.708</w:t>
+            </w:r>
+          </w:p>
+        </w:tc>
+        <w:tc>
+          <w:tcPr>
+            <w:tcMar>
+              <w:top w:type="dxa" w:w="40"/>
+              <w:left w:type="dxa" w:w="80"/>
+              <w:bottom w:type="dxa" w:w="40"/>
+              <w:right w:type="dxa" w:w="80"/>
+            </w:tcMar>
+          </w:tcPr>
+          <w:p>
+            <w:r>
+              <w:rPr>
+                <w:rFonts w:ascii="Times New Roman" w:cs="Times New Roman" w:eastAsia="Times New Roman" w:hAnsi="Times New Roman"/>
+                <w:sz w:val="18"/>
+                <w:szCs w:val="18"/>
+              </w:rPr>
+              <w:t xml:space="preserve">No</w:t>
+            </w:r>
+          </w:p>
+        </w:tc>
+      </w:tr>
+      <w:tr>
+        <w:tc>
+          <w:tcPr>
+            <w:shd w:fill="EFF2F7" w:val="clear"/>
+            <w:tcMar>
+              <w:top w:type="dxa" w:w="40"/>
+              <w:left w:type="dxa" w:w="80"/>
+              <w:bottom w:type="dxa" w:w="40"/>
+              <w:right w:type="dxa" w:w="80"/>
+            </w:tcMar>
+          </w:tcPr>
+          <w:p>
+            <w:r>
+              <w:rPr>
+                <w:rFonts w:ascii="Times New Roman" w:cs="Times New Roman" w:eastAsia="Times New Roman" w:hAnsi="Times New Roman"/>
+                <w:sz w:val="18"/>
+                <w:szCs w:val="18"/>
+              </w:rPr>
+              <w:t xml:space="preserve">50</w:t>
+            </w:r>
+          </w:p>
+        </w:tc>
+        <w:tc>
+          <w:tcPr>
+            <w:shd w:fill="EFF2F7" w:val="clear"/>
+            <w:tcMar>
+              <w:top w:type="dxa" w:w="40"/>
+              <w:left w:type="dxa" w:w="80"/>
+              <w:bottom w:type="dxa" w:w="40"/>
+              <w:right w:type="dxa" w:w="80"/>
+            </w:tcMar>
+          </w:tcPr>
+          <w:p>
+            <w:r>
+              <w:rPr>
+                <w:rFonts w:ascii="Times New Roman" w:cs="Times New Roman" w:eastAsia="Times New Roman" w:hAnsi="Times New Roman"/>
+                <w:sz w:val="18"/>
+                <w:szCs w:val="18"/>
+              </w:rPr>
+              <w:t xml:space="preserve">2.351%</w:t>
+            </w:r>
+          </w:p>
+        </w:tc>
+        <w:tc>
+          <w:tcPr>
+            <w:shd w:fill="EFF2F7" w:val="clear"/>
+            <w:tcMar>
+              <w:top w:type="dxa" w:w="40"/>
+              <w:left w:type="dxa" w:w="80"/>
+              <w:bottom w:type="dxa" w:w="40"/>
+              <w:right w:type="dxa" w:w="80"/>
+            </w:tcMar>
+          </w:tcPr>
+          <w:p>
+            <w:r>
+              <w:rPr>
+                <w:rFonts w:ascii="Times New Roman" w:cs="Times New Roman" w:eastAsia="Times New Roman" w:hAnsi="Times New Roman"/>
+                <w:sz w:val="18"/>
+                <w:szCs w:val="18"/>
+              </w:rPr>
+              <w:t xml:space="preserve">−0.430</w:t>
+            </w:r>
+          </w:p>
+        </w:tc>
+        <w:tc>
+          <w:tcPr>
+            <w:shd w:fill="EFF2F7" w:val="clear"/>
+            <w:tcMar>
+              <w:top w:type="dxa" w:w="40"/>
+              <w:left w:type="dxa" w:w="80"/>
+              <w:bottom w:type="dxa" w:w="40"/>
+              <w:right w:type="dxa" w:w="80"/>
+            </w:tcMar>
+          </w:tcPr>
+          <w:p>
+            <w:r>
+              <w:rPr>
+                <w:rFonts w:ascii="Times New Roman" w:cs="Times New Roman" w:eastAsia="Times New Roman" w:hAnsi="Times New Roman"/>
+                <w:sz w:val="18"/>
+                <w:szCs w:val="18"/>
+              </w:rPr>
+              <w:t xml:space="preserve">No</w:t>
+            </w:r>
+          </w:p>
+        </w:tc>
+      </w:tr>
+      <w:tr>
+        <w:tc>
+          <w:tcPr>
+            <w:tcMar>
+              <w:top w:type="dxa" w:w="40"/>
+              <w:left w:type="dxa" w:w="80"/>
+              <w:bottom w:type="dxa" w:w="40"/>
+              <w:right w:type="dxa" w:w="80"/>
+            </w:tcMar>
+          </w:tcPr>
+          <w:p>
+            <w:r>
+              <w:rPr>
+                <w:rFonts w:ascii="Times New Roman" w:cs="Times New Roman" w:eastAsia="Times New Roman" w:hAnsi="Times New Roman"/>
+                <w:sz w:val="18"/>
+                <w:szCs w:val="18"/>
+              </w:rPr>
+              <w:t xml:space="preserve">100</w:t>
+            </w:r>
+          </w:p>
+        </w:tc>
+        <w:tc>
+          <w:tcPr>
+            <w:tcMar>
+              <w:top w:type="dxa" w:w="40"/>
+              <w:left w:type="dxa" w:w="80"/>
+              <w:bottom w:type="dxa" w:w="40"/>
+              <w:right w:type="dxa" w:w="80"/>
+            </w:tcMar>
+          </w:tcPr>
+          <w:p>
+            <w:r>
+              <w:rPr>
+                <w:rFonts w:ascii="Times New Roman" w:cs="Times New Roman" w:eastAsia="Times New Roman" w:hAnsi="Times New Roman"/>
+                <w:sz w:val="18"/>
+                <w:szCs w:val="18"/>
+              </w:rPr>
+              <w:t xml:space="preserve">2.072%</w:t>
+            </w:r>
+          </w:p>
+        </w:tc>
+        <w:tc>
+          <w:tcPr>
+            <w:tcMar>
+              <w:top w:type="dxa" w:w="40"/>
+              <w:left w:type="dxa" w:w="80"/>
+              <w:bottom w:type="dxa" w:w="40"/>
+              <w:right w:type="dxa" w:w="80"/>
+            </w:tcMar>
+          </w:tcPr>
+          <w:p>
+            <w:r>
+              <w:rPr>
+                <w:rFonts w:ascii="Times New Roman" w:cs="Times New Roman" w:eastAsia="Times New Roman" w:hAnsi="Times New Roman"/>
+                <w:sz w:val="18"/>
+                <w:szCs w:val="18"/>
+              </w:rPr>
+              <w:t xml:space="preserve">−0.151</w:t>
+            </w:r>
+          </w:p>
+        </w:tc>
+        <w:tc>
+          <w:tcPr>
+            <w:tcMar>
+              <w:top w:type="dxa" w:w="40"/>
+              <w:left w:type="dxa" w:w="80"/>
+              <w:bottom w:type="dxa" w:w="40"/>
+              <w:right w:type="dxa" w:w="80"/>
+            </w:tcMar>
+          </w:tcPr>
+          <w:p>
+            <w:r>
+              <w:rPr>
+                <w:rFonts w:ascii="Times New Roman" w:cs="Times New Roman" w:eastAsia="Times New Roman" w:hAnsi="Times New Roman"/>
+                <w:sz w:val="18"/>
+                <w:szCs w:val="18"/>
+              </w:rPr>
+              <w:t xml:space="preserve">No</w:t>
+            </w:r>
+          </w:p>
+        </w:tc>
+      </w:tr>
+      <w:tr>
+        <w:tc>
+          <w:tcPr>
+            <w:shd w:fill="EFF2F7" w:val="clear"/>
+            <w:tcMar>
+              <w:top w:type="dxa" w:w="40"/>
+              <w:left w:type="dxa" w:w="80"/>
+              <w:bottom w:type="dxa" w:w="40"/>
+              <w:right w:type="dxa" w:w="80"/>
+            </w:tcMar>
+          </w:tcPr>
+          <w:p>
+            <w:r>
+              <w:rPr>
+                <w:rFonts w:ascii="Times New Roman" w:cs="Times New Roman" w:eastAsia="Times New Roman" w:hAnsi="Times New Roman"/>
+                <w:sz w:val="18"/>
+                <w:szCs w:val="18"/>
+              </w:rPr>
+              <w:t xml:space="preserve">120</w:t>
+            </w:r>
+          </w:p>
+        </w:tc>
+        <w:tc>
+          <w:tcPr>
+            <w:shd w:fill="EFF2F7" w:val="clear"/>
+            <w:tcMar>
+              <w:top w:type="dxa" w:w="40"/>
+              <w:left w:type="dxa" w:w="80"/>
+              <w:bottom w:type="dxa" w:w="40"/>
+              <w:right w:type="dxa" w:w="80"/>
+            </w:tcMar>
+          </w:tcPr>
+          <w:p>
+            <w:r>
+              <w:rPr>
+                <w:rFonts w:ascii="Times New Roman" w:cs="Times New Roman" w:eastAsia="Times New Roman" w:hAnsi="Times New Roman"/>
+                <w:sz w:val="18"/>
+                <w:szCs w:val="18"/>
+              </w:rPr>
+              <w:t xml:space="preserve">1.961%</w:t>
+            </w:r>
+          </w:p>
+        </w:tc>
+        <w:tc>
+          <w:tcPr>
+            <w:shd w:fill="EFF2F7" w:val="clear"/>
+            <w:tcMar>
+              <w:top w:type="dxa" w:w="40"/>
+              <w:left w:type="dxa" w:w="80"/>
+              <w:bottom w:type="dxa" w:w="40"/>
+              <w:right w:type="dxa" w:w="80"/>
+            </w:tcMar>
+          </w:tcPr>
+          <w:p>
+            <w:r>
+              <w:rPr>
+                <w:rFonts w:ascii="Times New Roman" w:cs="Times New Roman" w:eastAsia="Times New Roman" w:hAnsi="Times New Roman"/>
+                <w:sz w:val="18"/>
+                <w:szCs w:val="18"/>
+              </w:rPr>
+              <w:t xml:space="preserve">−0.040</w:t>
+            </w:r>
+          </w:p>
+        </w:tc>
+        <w:tc>
+          <w:tcPr>
+            <w:shd w:fill="EFF2F7" w:val="clear"/>
+            <w:tcMar>
+              <w:top w:type="dxa" w:w="40"/>
+              <w:left w:type="dxa" w:w="80"/>
+              <w:bottom w:type="dxa" w:w="40"/>
+              <w:right w:type="dxa" w:w="80"/>
+            </w:tcMar>
+          </w:tcPr>
+          <w:p>
+            <w:r>
+              <w:rPr>
+                <w:rFonts w:ascii="Times New Roman" w:cs="Times New Roman" w:eastAsia="Times New Roman" w:hAnsi="Times New Roman"/>
+                <w:sz w:val="18"/>
+                <w:szCs w:val="18"/>
+              </w:rPr>
+              <w:t xml:space="preserve">No</w:t>
+            </w:r>
+          </w:p>
+        </w:tc>
+      </w:tr>
+      <w:tr>
+        <w:tc>
+          <w:tcPr>
+            <w:tcMar>
+              <w:top w:type="dxa" w:w="40"/>
+              <w:left w:type="dxa" w:w="80"/>
+              <w:bottom w:type="dxa" w:w="40"/>
+              <w:right w:type="dxa" w:w="80"/>
+            </w:tcMar>
+          </w:tcPr>
+          <w:p>
+            <w:r>
+              <w:rPr>
+                <w:rFonts w:ascii="Times New Roman" w:cs="Times New Roman" w:eastAsia="Times New Roman" w:hAnsi="Times New Roman"/>
+                <w:sz w:val="18"/>
+                <w:szCs w:val="18"/>
+              </w:rPr>
+              <w:t xml:space="preserve">130</w:t>
+            </w:r>
+          </w:p>
+        </w:tc>
+        <w:tc>
+          <w:tcPr>
+            <w:tcMar>
+              <w:top w:type="dxa" w:w="40"/>
+              <w:left w:type="dxa" w:w="80"/>
+              <w:bottom w:type="dxa" w:w="40"/>
+              <w:right w:type="dxa" w:w="80"/>
+            </w:tcMar>
+          </w:tcPr>
+          <w:p>
+            <w:r>
+              <w:rPr>
+                <w:rFonts w:ascii="Times New Roman" w:cs="Times New Roman" w:eastAsia="Times New Roman" w:hAnsi="Times New Roman"/>
+                <w:sz w:val="18"/>
+                <w:szCs w:val="18"/>
+              </w:rPr>
+              <w:t xml:space="preserve">1.905%</w:t>
+            </w:r>
+          </w:p>
+        </w:tc>
+        <w:tc>
+          <w:tcPr>
+            <w:tcMar>
+              <w:top w:type="dxa" w:w="40"/>
+              <w:left w:type="dxa" w:w="80"/>
+              <w:bottom w:type="dxa" w:w="40"/>
+              <w:right w:type="dxa" w:w="80"/>
+            </w:tcMar>
+          </w:tcPr>
+          <w:p>
+            <w:r>
+              <w:rPr>
+                <w:rFonts w:ascii="Times New Roman" w:cs="Times New Roman" w:eastAsia="Times New Roman" w:hAnsi="Times New Roman"/>
+                <w:sz w:val="18"/>
+                <w:szCs w:val="18"/>
+              </w:rPr>
+              <w:t xml:space="preserve">+0.016</w:t>
+            </w:r>
+          </w:p>
+        </w:tc>
+        <w:tc>
+          <w:tcPr>
+            <w:tcMar>
+              <w:top w:type="dxa" w:w="40"/>
+              <w:left w:type="dxa" w:w="80"/>
+              <w:bottom w:type="dxa" w:w="40"/>
+              <w:right w:type="dxa" w:w="80"/>
+            </w:tcMar>
+          </w:tcPr>
+          <w:p>
+            <w:r>
+              <w:rPr>
+                <w:rFonts w:ascii="Times New Roman" w:cs="Times New Roman" w:eastAsia="Times New Roman" w:hAnsi="Times New Roman"/>
+                <w:sz w:val="18"/>
+                <w:szCs w:val="18"/>
+              </w:rPr>
+              <w:t xml:space="preserve">Yes</w:t>
+            </w:r>
+          </w:p>
+        </w:tc>
+      </w:tr>
+      <w:tr>
+        <w:tc>
+          <w:tcPr>
+            <w:shd w:fill="EFF2F7" w:val="clear"/>
+            <w:tcMar>
+              <w:top w:type="dxa" w:w="40"/>
+              <w:left w:type="dxa" w:w="80"/>
+              <w:bottom w:type="dxa" w:w="40"/>
+              <w:right w:type="dxa" w:w="80"/>
+            </w:tcMar>
+          </w:tcPr>
+          <w:p>
+            <w:r>
+              <w:rPr>
+                <w:rFonts w:ascii="Times New Roman" w:cs="Times New Roman" w:eastAsia="Times New Roman" w:hAnsi="Times New Roman"/>
+                <w:sz w:val="18"/>
+                <w:szCs w:val="18"/>
+              </w:rPr>
+              <w:t xml:space="preserve">150</w:t>
+            </w:r>
+          </w:p>
+        </w:tc>
+        <w:tc>
+          <w:tcPr>
+            <w:shd w:fill="EFF2F7" w:val="clear"/>
+            <w:tcMar>
+              <w:top w:type="dxa" w:w="40"/>
+              <w:left w:type="dxa" w:w="80"/>
+              <w:bottom w:type="dxa" w:w="40"/>
+              <w:right w:type="dxa" w:w="80"/>
+            </w:tcMar>
+          </w:tcPr>
+          <w:p>
+            <w:r>
+              <w:rPr>
+                <w:rFonts w:ascii="Times New Roman" w:cs="Times New Roman" w:eastAsia="Times New Roman" w:hAnsi="Times New Roman"/>
+                <w:sz w:val="18"/>
+                <w:szCs w:val="18"/>
+              </w:rPr>
+              <w:t xml:space="preserve">1.794%</w:t>
+            </w:r>
+          </w:p>
+        </w:tc>
+        <w:tc>
+          <w:tcPr>
+            <w:shd w:fill="EFF2F7" w:val="clear"/>
+            <w:tcMar>
+              <w:top w:type="dxa" w:w="40"/>
+              <w:left w:type="dxa" w:w="80"/>
+              <w:bottom w:type="dxa" w:w="40"/>
+              <w:right w:type="dxa" w:w="80"/>
+            </w:tcMar>
+          </w:tcPr>
+          <w:p>
+            <w:r>
+              <w:rPr>
+                <w:rFonts w:ascii="Times New Roman" w:cs="Times New Roman" w:eastAsia="Times New Roman" w:hAnsi="Times New Roman"/>
+                <w:sz w:val="18"/>
+                <w:szCs w:val="18"/>
+              </w:rPr>
+              <w:t xml:space="preserve">+0.127</w:t>
+            </w:r>
+          </w:p>
+        </w:tc>
+        <w:tc>
+          <w:tcPr>
+            <w:shd w:fill="EFF2F7" w:val="clear"/>
+            <w:tcMar>
+              <w:top w:type="dxa" w:w="40"/>
+              <w:left w:type="dxa" w:w="80"/>
+              <w:bottom w:type="dxa" w:w="40"/>
+              <w:right w:type="dxa" w:w="80"/>
+            </w:tcMar>
+          </w:tcPr>
+          <w:p>
+            <w:r>
+              <w:rPr>
+                <w:rFonts w:ascii="Times New Roman" w:cs="Times New Roman" w:eastAsia="Times New Roman" w:hAnsi="Times New Roman"/>
+                <w:sz w:val="18"/>
+                <w:szCs w:val="18"/>
+              </w:rPr>
+              <w:t xml:space="preserve">Yes</w:t>
+            </w:r>
+          </w:p>
+        </w:tc>
+      </w:tr>
+    </w:tbl>
+    <w:p>
+      <w:pPr>
+        <w:spacing w:after="160"/>
+      </w:pPr>
+      <w:r>
+        <w:rPr>
+          <w:rFonts w:ascii="Times New Roman" w:cs="Times New Roman" w:eastAsia="Times New Roman" w:hAnsi="Times New Roman"/>
+          <w:i/>
+          <w:iCs/>
+          <w:sz w:val="16"/>
+          <w:szCs w:val="16"/>
+        </w:rPr>
+        <w:t xml:space="preserve">Source: data/processed/tokenization_coe_sweep.csv. FIRR held at the ADB base of 1.921%.</w:t>
+      </w:r>
+    </w:p>
+    <w:p>
+      <w:pPr>
+        <w:spacing w:after="60" w:before="120"/>
+        <w:jc w:val="center"/>
+      </w:pPr>
+      <w:r>
+        <w:drawing>
+          <wp:inline distT="0" distB="0" distL="0" distR="0">
+            <wp:extent cx="5143500" cy="3238500"/>
+            <wp:effectExtent t="0" r="0" b="0" l="0"/>
+            <wp:docPr id="1" name="" descr="" title=""/>
+            <wp:cNvGraphicFramePr>
+              <a:graphicFrameLocks xmlns:a="http://schemas.openxmlformats.org/drawingml/2006/main" noChangeAspect="1"/>
+            </wp:cNvGraphicFramePr>
+            <a:graphic xmlns:a="http://schemas.openxmlformats.org/drawingml/2006/main">
+              <a:graphicData uri="http://schemas.openxmlformats.org/drawingml/2006/picture">
+                <pic:pic xmlns:pic="http://schemas.openxmlformats.org/drawingml/2006/picture">
+                  <pic:nvPicPr>
+                    <pic:cNvPr id="0" name="" descr=""/>
+                    <pic:cNvPicPr>
+                      <a:picLocks noChangeAspect="1" noChangeArrowheads="1"/>
+                    </pic:cNvPicPr>
+                  </pic:nvPicPr>
+                  <pic:blipFill>
+                    <a:blip r:embed="rId15" cstate="none"/>
+                    <a:srcRect/>
+                    <a:stretch>
+                      <a:fillRect/>
+                    </a:stretch>
+                  </pic:blipFill>
+                  <pic:spPr bwMode="auto">
+                    <a:xfrm>
+                      <a:off x="0" y="0"/>
+                      <a:ext cx="5143500" cy="3238500"/>
+                    </a:xfrm>
+                    <a:prstGeom prst="rect">
+                      <a:avLst/>
+                    </a:prstGeom>
+                  </pic:spPr>
+                </pic:pic>
+              </a:graphicData>
+            </a:graphic>
+          </wp:inline>
+        </w:drawing>
+      </w:r>
+    </w:p>
+    <w:p>
+      <w:pPr>
+        <w:spacing w:after="200"/>
+        <w:jc w:val="center"/>
+      </w:pPr>
+      <w:r>
+        <w:rPr>
+          <w:rFonts w:ascii="Calibri" w:cs="Calibri" w:eastAsia="Calibri" w:hAnsi="Calibri"/>
+          <w:b/>
+          <w:bCs/>
+          <w:sz w:val="18"/>
+          <w:szCs w:val="18"/>
+        </w:rPr>
+        <w:t xml:space="preserve">Figure 7. </w:t>
+      </w:r>
+      <w:r>
+        <w:rPr>
+          <w:rFonts w:ascii="Calibri" w:cs="Calibri" w:eastAsia="Calibri" w:hAnsi="Calibri"/>
+          <w:i/>
+          <w:iCs/>
+          <w:sz w:val="18"/>
+          <w:szCs w:val="18"/>
+        </w:rPr>
+        <w:t xml:space="preserve">Cost-of-equity break-even sweep: the viability gap closes only at roughly a 130-basis-point reduction in the cost of equity. notebooks/03_montecarlo_firr.py.</w:t>
+      </w:r>
+    </w:p>
+    <w:p>
+      <w:pPr>
+        <w:spacing w:after="60" w:before="120"/>
+        <w:jc w:val="center"/>
+      </w:pPr>
+      <w:r>
+        <w:drawing>
+          <wp:inline distT="0" distB="0" distL="0" distR="0">
+            <wp:extent cx="5143500" cy="3429000"/>
+            <wp:effectExtent t="0" r="0" b="0" l="0"/>
+            <wp:docPr id="1" name="" descr="" title=""/>
+            <wp:cNvGraphicFramePr>
+              <a:graphicFrameLocks xmlns:a="http://schemas.openxmlformats.org/drawingml/2006/main" noChangeAspect="1"/>
+            </wp:cNvGraphicFramePr>
+            <a:graphic xmlns:a="http://schemas.openxmlformats.org/drawingml/2006/main">
+              <a:graphicData uri="http://schemas.openxmlformats.org/drawingml/2006/picture">
+                <pic:pic xmlns:pic="http://schemas.openxmlformats.org/drawingml/2006/picture">
+                  <pic:nvPicPr>
+                    <pic:cNvPr id="0" name="" descr=""/>
+                    <pic:cNvPicPr>
+                      <a:picLocks noChangeAspect="1" noChangeArrowheads="1"/>
+                    </pic:cNvPicPr>
+                  </pic:nvPicPr>
+                  <pic:blipFill>
+                    <a:blip r:embed="rId16" cstate="none"/>
+                    <a:srcRect/>
+                    <a:stretch>
+                      <a:fillRect/>
+                    </a:stretch>
+                  </pic:blipFill>
+                  <pic:spPr bwMode="auto">
+                    <a:xfrm>
+                      <a:off x="0" y="0"/>
+                      <a:ext cx="5143500" cy="3429000"/>
+                    </a:xfrm>
+                    <a:prstGeom prst="rect">
+                      <a:avLst/>
+                    </a:prstGeom>
+                  </pic:spPr>
+                </pic:pic>
+              </a:graphicData>
+            </a:graphic>
+          </wp:inline>
+        </w:drawing>
+      </w:r>
+    </w:p>
+    <w:p>
+      <w:pPr>
+        <w:spacing w:after="200"/>
+        <w:jc w:val="center"/>
+      </w:pPr>
+      <w:r>
+        <w:rPr>
+          <w:rFonts w:ascii="Calibri" w:cs="Calibri" w:eastAsia="Calibri" w:hAnsi="Calibri"/>
+          <w:b/>
+          <w:bCs/>
+          <w:sz w:val="18"/>
+          <w:szCs w:val="18"/>
+        </w:rPr>
+        <w:t xml:space="preserve">Figure 8. </w:t>
+      </w:r>
+      <w:r>
+        <w:rPr>
+          <w:rFonts w:ascii="Calibri" w:cs="Calibri" w:eastAsia="Calibri" w:hAnsi="Calibri"/>
+          <w:i/>
+          <w:iCs/>
+          <w:sz w:val="18"/>
+          <w:szCs w:val="18"/>
+        </w:rPr>
+        <w:t xml:space="preserve">Two-way FIRR sensitivity surface over the ridership and capital-cost multipliers, with the 2.629% WACC contour. notebooks/03_montecarlo_firr.py.</w:t>
+      </w:r>
+    </w:p>
+    <w:p>
+      <w:pPr>
+        <w:spacing w:after="100" w:before="200"/>
+      </w:pPr>
+      <w:r>
+        <w:rPr>
+          <w:rFonts w:ascii="Times New Roman" w:cs="Times New Roman" w:eastAsia="Times New Roman" w:hAnsi="Times New Roman"/>
+          <w:b/>
+          <w:bCs/>
+          <w:i/>
+          <w:iCs/>
+          <w:color w:val="2E4B7A"/>
+          <w:sz w:val="22"/>
+          <w:szCs w:val="22"/>
+        </w:rPr>
+        <w:t xml:space="preserve">5.5. Why PRR may be the better tokenization candidate</w:t>
+      </w:r>
+    </w:p>
+    <w:p>
+      <w:pPr>
+        <w:spacing w:after="140" w:line="276"/>
+        <w:jc w:val="both"/>
+      </w:pPr>
+      <w:r>
+        <w:rPr>
+          <w:rFonts w:ascii="Times New Roman" w:cs="Times New Roman" w:eastAsia="Times New Roman" w:hAnsi="Times New Roman"/>
+          <w:sz w:val="21"/>
+          <w:szCs w:val="21"/>
+        </w:rPr>
+        <w:t xml:space="preserve">The metro’s cost of capital is already extraordinarily low because of concessional sovereign debt; there is little room for tokenized equity to undercut a 0% real JICA loan. The PRR/BBC is different. Its dominant cost is land acquisition (~₹21,000 crore of ~₹27,000 crore), it is financed substantially through HUDCO borrowing rather than ultra-concessional ODA, and a betterment-levy or land-value-capture structure maps naturally onto a tokenized unit backed by toll and monetized-land cash flows. The viability arithmetic we cannot complete for PRR — no primary DPR is public — but the structure of its cost base is where a T-InvIT’s access and pricing advantages would bite hardest.</w:t>
       </w:r>
     </w:p>
     <w:p>
@@ -2111,7 +3272,7 @@
           <w:sz w:val="26"/>
           <w:szCs w:val="26"/>
         </w:rPr>
-        <w:t xml:space="preserve">6. A T-InvIT design proposal</w:t>
+        <w:t xml:space="preserve">6. A T-InvIT Design Proposal</w:t>
       </w:r>
     </w:p>
     <w:p>
@@ -2125,7 +3286,7 @@
           <w:sz w:val="21"/>
           <w:szCs w:val="21"/>
         </w:rPr>
-        <w:t xml:space="preserve">Building on the SEBI September-2025 reform, we sketch a compliance-feasible structure: a SEBI-registered InvIT holding the operating asset (metro fare/non-fare revenue, or PRR toll plus land-value-capture receipts), with units recorded on a permissioned ledger for transfer and beneficial-ownership tracking while remaining within the dematerialized-securities and InvIT regulatory perimeter. The ₹25 lakh minimum (post-amendment) is the enabling threshold for a privately placed tranche; a publicly listed tranche follows the standard InvIT route. We stop short of claiming on-chain settlement against SEBI’s current rails — no such structure is live in India today — and treat the ledger layer as a register-and-transfer overlay, not a replacement for the existing depository system.</w:t>
+        <w:t xml:space="preserve">Building on the SEBI September-2025 reform, we sketch a compliance-feasible structure: a SEBI-registered InvIT holding the operating asset (metro fare/non-fare revenue, or PRR toll plus land-value-capture receipts), with units recorded on a permissioned ledger for transfer and beneficial-ownership tracking while remaining within the dematerialized-securities and InvIT regulatory perimeter. The ₹25 lakh minimum (post-amendment) is the enabling threshold for a privately placed tranche; a publicly listed tranche would follow the standard InvIT route. We stop short of claiming on-chain settlement against SEBI’s current rails — no such structure is live in India today — and treat the ledger layer as a register-and-transfer overlay, not a replacement for the existing depository system.</w:t>
       </w:r>
     </w:p>
     <w:p>
@@ -2141,7 +3302,7 @@
           <w:sz w:val="26"/>
           <w:szCs w:val="26"/>
         </w:rPr>
-        <w:t xml:space="preserve">7. Limitations</w:t>
+        <w:t xml:space="preserve">7. Discussion</w:t>
       </w:r>
     </w:p>
     <w:p>
@@ -2155,7 +3316,7 @@
           <w:sz w:val="21"/>
           <w:szCs w:val="21"/>
         </w:rPr>
-        <w:t xml:space="preserve">Three caveats. First, the FIRR sensitivity is a model simulation, not a re-estimation of ADB’s full cash-flow model, which is not public at line-item granularity. Second, our 12 km average-trip assumption drives the revenue scale and is ours, not ADB’s. Third, the PRR analysis is qualitative because no primary DPR is publicly available, and the practitioner survey envisaged for this project has not been fielded — we report no survey results rather than invent any.</w:t>
+        <w:t xml:space="preserve">The results reposition tokenization from a profitability promise to a cost-of-capital and subsidy-reduction instrument. For an asset already financed at near-zero real cost by sovereign lenders, the marginal benefit of tokenized equity is small by construction; the lever bites hardest on assets whose cost base is dominated by market-priced or land-acquisition financing. This is consistent with the broader liquidity evidence on listed Indian InvITs/REITs, where participation breadth — not the regulatory event per se — is the dominant correlate of liquidity (Sandeep, 2025).</w:t>
       </w:r>
     </w:p>
     <w:p>
@@ -2171,7 +3332,7 @@
           <w:sz w:val="26"/>
           <w:szCs w:val="26"/>
         </w:rPr>
-        <w:t xml:space="preserve">8. Conclusion</w:t>
+        <w:t xml:space="preserve">8. Limitations</w:t>
       </w:r>
     </w:p>
     <w:p>
@@ -2185,7 +3346,7 @@
           <w:sz w:val="21"/>
           <w:szCs w:val="21"/>
         </w:rPr>
-        <w:t xml:space="preserve">Tokenization will not, on the numbers, turn a sub-WACC metro into a market-viable one. What it can plausibly do — and what the SEBI 2025 reform now makes regulatorily feasible — is widen the investor base, lower the cost of the equity slice, and thereby reduce the sovereign subsidy required to keep these socially valuable assets financeable. For Bengaluru, the metro is the cleaner test of the concept because its economics are fully disclosed; the Peripheral Ring Road is the more promising application because its cost base leaves more room for a tokenized, land-value-capture-backed structure. The contribution here is to replace the conference-stage promise with a number: a credible tokenization scenario narrows the metro’s viability gap by roughly six-tenths, from −0.708 to about −0.28 percentage points — meaningful, but not the whole distance.</w:t>
+        <w:t xml:space="preserve">Four honest caveats. First, our discounted-cash-flow FIRR model is not a re-estimation of ADB’s full model, which is not public at line-item granularity; we reproduce ADB’s level through a single transparent, documented +2.943 pp calibration shift and use the model only for its relative sensitivities, but the absolute FIRR remains ADB’s, not independently re-derived. Second, the 12 km average-trip assumption — which the tornado shows is the second-largest variance driver — is ours, not ADB’s, and is flagged throughout; a reader who prefers a different trip length can re-run the committed notebook. Third, the ADB Financial Analysis PDF (project 53326-001) is not redistributable: ADB’s server returns HTTP 403, so we log the canonical URL, access date, and the full extracted figure set in data/raw/JICA_loans/ADB/ADB_FA_download_status.md rather than committing the PDF. Fourth, the PRR analysis is qualitative because no primary DPR or Government Order is publicly available (only a February-2024 tender to prepare the DPR), and the practitioner survey envisaged for this project has not been fielded — we report no survey results rather than invent any, and no tokenized InvIT yet exists in India against which to validate the design.</w:t>
       </w:r>
     </w:p>
     <w:p>
@@ -2201,7 +3362,7 @@
           <w:sz w:val="26"/>
           <w:szCs w:val="26"/>
         </w:rPr>
-        <w:t xml:space="preserve">Data availability</w:t>
+        <w:t xml:space="preserve">9. Conclusion</w:t>
       </w:r>
     </w:p>
     <w:p>
@@ -2215,7 +3376,7 @@
           <w:sz w:val="21"/>
           <w:szCs w:val="21"/>
         </w:rPr>
-        <w:t xml:space="preserve">All figures and tables are generated by notebooks/02_firr_wacc_forecast.py from committed inputs in the public repository at https://github.com/SanKabira/P1-TInvIT-Bengaluru-RWA-Tokenization. Where a publisher restricts redistribution (ADB), the retrieval URL and access date are logged in DATA_SOURCES.md with the extracted figures in a status file. No data were fabricated; the survey arm is marked pending. Run from the repo root: python3 notebooks/02_firr_wacc_forecast.py.</w:t>
+        <w:t xml:space="preserve">Tokenization will not, on the numbers, turn a sub-WACC metro into a market-viable one. What it can plausibly do — and what the SEBI 2025 reform now makes regulatorily feasible — is widen the investor base, lower the cost of the equity slice, and thereby reduce the sovereign subsidy required to keep these socially valuable assets financeable. For Bengaluru, the metro is the cleaner test of the concept because its economics are fully disclosed; the Peripheral Ring Road is the more promising application because its cost base leaves more room for a tokenized, land-value-capture-backed structure to add value. The contribution here is to replace the conference-stage promise with a distribution and a threshold: the simulated FIRR clears the 2.629% WACC only 10.9% of the time, and closing the viability gap through tokenization’s one genuine lever — a lower cost of equity — would require roughly a 130-basis-point equity-cost reduction. That is a meaningful, quantified bar rather than a slogan: tokenization can plausibly move the metro part of the way, but not the whole distance, and the more promising application is an asset like the PRR whose market-priced, land-acquisition-heavy cost base leaves far more room for the lever to bite.</w:t>
       </w:r>
     </w:p>
     <w:p>
@@ -2231,7 +3392,7 @@
           <w:sz w:val="26"/>
           <w:szCs w:val="26"/>
         </w:rPr>
-        <w:t xml:space="preserve">Declaration of competing interest</w:t>
+        <w:t xml:space="preserve">10. Data and Software Availability</w:t>
       </w:r>
     </w:p>
     <w:p>
@@ -2245,7 +3406,7 @@
           <w:sz w:val="21"/>
           <w:szCs w:val="21"/>
         </w:rPr>
-        <w:t xml:space="preserve">The author declares no competing financial interests or personal relationships that could have influenced this work.</w:t>
+        <w:t xml:space="preserve">All raw inputs, processed datasets, notebooks, and figures are openly archived in the public GitHub repository https://github.com/SanKabira/P1-TInvIT-Bengaluru-RWA-Tokenization. Figures 1–4 (fig1_wacc_firr_gap.png, fig2_ridership_forecast.png, fig3_revenue_forecast.png, fig4_firr_sensitivity_tornado.png) are regenerated by notebooks/02_firr_wacc_forecast.py; the Monte Carlo Figures 5–8 (fig5_mc_firr_distribution.png, fig6_mc_tornado.png, fig7_tokenization_coe_sweep.png, fig8_mc_sensitivity_surface.png) and the simulation tables (mc_firr_summary.csv, firr_tornado.csv, assumption_ranges.csv, calibration_log.csv, tokenization_coe_sweep.csv) are regenerated by notebooks/03_montecarlo_firr.py (seed 53326). Run from the repository root: python3 notebooks/02_firr_wacc_forecast.py &amp;&amp; python3 notebooks/03_montecarlo_firr.py. The companion empirical study on listed InvIT/REIT liquidity is archived at https://github.com/SanKabira/P2-BInvIT-India-Tokenization-Empirical.</w:t>
       </w:r>
     </w:p>
     <w:p>
@@ -2261,6 +3422,36 @@
           <w:sz w:val="26"/>
           <w:szCs w:val="26"/>
         </w:rPr>
+        <w:t xml:space="preserve">Declaration of Competing Interest</w:t>
+      </w:r>
+    </w:p>
+    <w:p>
+      <w:pPr>
+        <w:spacing w:after="140" w:line="276"/>
+        <w:jc w:val="both"/>
+      </w:pPr>
+      <w:r>
+        <w:rPr>
+          <w:rFonts w:ascii="Times New Roman" w:cs="Times New Roman" w:eastAsia="Times New Roman" w:hAnsi="Times New Roman"/>
+          <w:sz w:val="21"/>
+          <w:szCs w:val="21"/>
+        </w:rPr>
+        <w:t xml:space="preserve">The author declares no competing financial interests or personal relationships that could have influenced this work.</w:t>
+      </w:r>
+    </w:p>
+    <w:p>
+      <w:pPr>
+        <w:spacing w:after="120" w:before="280"/>
+      </w:pPr>
+      <w:r>
+        <w:rPr>
+          <w:rFonts w:ascii="Times New Roman" w:cs="Times New Roman" w:eastAsia="Times New Roman" w:hAnsi="Times New Roman"/>
+          <w:b/>
+          <w:bCs/>
+          <w:color w:val="1F3864"/>
+          <w:sz w:val="26"/>
+          <w:szCs w:val="26"/>
+        </w:rPr>
         <w:t xml:space="preserve">References</w:t>
       </w:r>
     </w:p>
@@ -2275,7 +3466,7 @@
           <w:sz w:val="18"/>
           <w:szCs w:val="18"/>
         </w:rPr>
-        <w:t xml:space="preserve">Amihud, Y. (2002). Illiquidity and stock returns: cross-section and time-series effects. Journal of Financial Markets, 5(1), 31–56. https://doi.org/10.1016/S1386-4181(01)00024-6</w:t>
+        <w:t xml:space="preserve">Amihud, Y., 2002. Illiquidity and stock returns: cross-section and time-series effects. Journal of Financial Markets, 5(1), pp.31–56. https://doi.org/10.1016/S1386-4181(01)00024-6</w:t>
       </w:r>
     </w:p>
     <w:p>
@@ -2289,7 +3480,7 @@
           <w:sz w:val="18"/>
           <w:szCs w:val="18"/>
         </w:rPr>
-        <w:t xml:space="preserve">Asian Development Bank. (2020). Financial Analysis: India — Bengaluru Metro Rail Project (Phase 2A/2B). Linked Document IND-53326-001-FA. Manila. https://www.adb.org/sites/default/files/linked-documents/ind-53326-001-fa.pdf</w:t>
+        <w:t xml:space="preserve">Asian Development Bank, 2020. Financial Analysis: India — Bengaluru Metro Rail Project (Phase 2A/2B). Linked Document IND-53326-001-FA. Manila: Asian Development Bank. https://www.adb.org/sites/default/files/linked-documents/ind-53326-001-fa.pdf</w:t>
       </w:r>
     </w:p>
     <w:p>
@@ -2303,7 +3494,7 @@
           <w:sz w:val="18"/>
           <w:szCs w:val="18"/>
         </w:rPr>
-        <w:t xml:space="preserve">AZB &amp; Partners. (2025). SEBI Amends InvIT Regulations and REIT Regulations. https://www.azbpartners.com/bank/sebi-amends-invit-regulations-and-reit-regulations/</w:t>
+        <w:t xml:space="preserve">Assab, A., 2024. Theoretical foundation for pricing climate-related loss and damage in infrastructure financing. Journal of Risk and Financial Management, 17(4), p.133. https://doi.org/10.3390/jrfm17040133</w:t>
       </w:r>
     </w:p>
     <w:p>
@@ -2317,7 +3508,7 @@
           <w:sz w:val="18"/>
           <w:szCs w:val="18"/>
         </w:rPr>
-        <w:t xml:space="preserve">Deccan Herald. (2026). Bengaluru: in bid to complete PRR, govt to offer higher compensation for 948 acres.</w:t>
+        <w:t xml:space="preserve">El Jaouhari, A., Samadhiya, A., Kumar, A., Chokshi, H., Šešplaukis, A. and Raslanas, S., 2025. Tokenization and the future of property investment: a new paradigm for real estate. International Journal of Strategic Property Management, 29(4), pp.297–315. https://doi.org/10.3846/ijspm.2025.24814</w:t>
       </w:r>
     </w:p>
     <w:p>
@@ -2331,7 +3522,7 @@
           <w:sz w:val="18"/>
           <w:szCs w:val="18"/>
         </w:rPr>
-        <w:t xml:space="preserve">Deloitte Center for Financial Services. (2025). Tokenized real estate: A blockchain-based pathway to a US$4 trillion market by 2035.</w:t>
+        <w:t xml:space="preserve">Esty, B.C., 2004. Modern Project Finance: A Casebook. New York: John Wiley &amp; Sons.</w:t>
       </w:r>
     </w:p>
     <w:p>
@@ -2345,7 +3536,7 @@
           <w:sz w:val="18"/>
           <w:szCs w:val="18"/>
         </w:rPr>
-        <w:t xml:space="preserve">El Jaouhari, A., et al. (2025). Tokenization and the future of property investment. International Journal of Strategic Property Management, 29(4), 297–315. https://doi.org/10.3846/ijspm.2025.24814</w:t>
+        <w:t xml:space="preserve">Japan International Cooperation Agency, 2026. Signing of Japanese ODA Loan for the Bangalore Metro Rail Project (Phase 3): Ex-Ante Evaluation. Tokyo: JICA. https://www.jica.go.jp/english/information/press/2025/20260324_11.html</w:t>
       </w:r>
     </w:p>
     <w:p>
@@ -2359,7 +3550,7 @@
           <w:sz w:val="18"/>
           <w:szCs w:val="18"/>
         </w:rPr>
-        <w:t xml:space="preserve">Esty, B. C. (2004). Modern Project Finance: A Casebook. John Wiley &amp; Sons.</w:t>
+        <w:t xml:space="preserve">Mirdala, R., 2025. Tokenization of real-world assets: legal frameworks, market dynamics, and policy pathways for a decentralized financial future. Journal of Applied Economic Sciences, 20(2(88)), pp.285–298. https://doi.org/10.57017/jaes.v20.2(88).09</w:t>
       </w:r>
     </w:p>
     <w:p>
@@ -2373,7 +3564,7 @@
           <w:sz w:val="18"/>
           <w:szCs w:val="18"/>
         </w:rPr>
-        <w:t xml:space="preserve">Japan International Cooperation Agency. (2026). Signing of Japanese ODA Loan for the Bangalore Metro Rail Project (Phase 3): Ex-Ante Evaluation. https://www.jica.go.jp/english/information/press/2025/20260324_11.html</w:t>
+        <w:t xml:space="preserve">Moneycontrol, 2026. Bengaluru Business Corridor (Peripheral Ring Road): cost and package-award reporting. https://www.moneycontrol.com/news/india/</w:t>
       </w:r>
     </w:p>
     <w:p>
@@ -2387,7 +3578,7 @@
           <w:sz w:val="18"/>
           <w:szCs w:val="18"/>
         </w:rPr>
-        <w:t xml:space="preserve">Mirdala, R. (2025). Tokenization of Real-World Assets: Legal Frameworks and Market Implications. Journal of Applied Economic Sciences, 20(2(88)). https://doi.org/10.57017/jaes.v20.2(88).09</w:t>
+        <w:t xml:space="preserve">Pillada, N. and Rangasamy, S., 2023. An empirical investigation of investor sentiment and volatility of the realty sector market in India: an application of the DCC–GARCH model. SN Business &amp; Economics, 3(2), p.54. https://doi.org/10.1007/s43546-023-00434-3</w:t>
       </w:r>
     </w:p>
     <w:p>
@@ -2401,7 +3592,7 @@
           <w:sz w:val="18"/>
           <w:szCs w:val="18"/>
         </w:rPr>
-        <w:t xml:space="preserve">Moneycontrol. (2026). Bengaluru Business Corridor: Package 1 awarded; total project ~₹27,000 crore, land acquisition ~₹21,000 crore.</w:t>
+        <w:t xml:space="preserve">Popov, E., Veretennikova, A. and Fedoreev, S., 2022. The model of OTC securities market transformation in the context of asset tokenization. Mathematics, 10(19), p.3441. https://doi.org/10.3390/math10193441</w:t>
       </w:r>
     </w:p>
     <w:p>
@@ -2415,7 +3606,7 @@
           <w:sz w:val="18"/>
           <w:szCs w:val="18"/>
         </w:rPr>
-        <w:t xml:space="preserve">Securities and Exchange Board of India. (2025). SEBI (Infrastructure Investment Trusts) (Third Amendment) Regulations, 2025. Gazette of India, 2 September 2025. https://www.sebi.gov.in/sebi_data/attachdocs/sep-2025/1757046936652.pdf</w:t>
+        <w:t xml:space="preserve">Saari, A., Vimpari, J. and Junnila, S., 2022. Blockchain in real estate: recent developments and empirical applications. Land Use Policy, 121, p.106334. https://doi.org/10.1016/j.landusepol.2022.106334</w:t>
       </w:r>
     </w:p>
     <w:p>
@@ -2429,7 +3620,7 @@
           <w:sz w:val="18"/>
           <w:szCs w:val="18"/>
         </w:rPr>
-        <w:t xml:space="preserve">Swinkels, L. (2023). Empirical evidence on the ownership and liquidity of real estate tokens. Financial Innovation, 9(1). https://doi.org/10.1186/s40854-022-00427-5</w:t>
+        <w:t xml:space="preserve">Sandeep, S., 2025. Did lowering the entry ticket move the needle? Liquidity around SEBI's 2025 InvIT reform, and what it implies for tokenization [Companion empirical manuscript]. https://github.com/SanKabira/P2-BInvIT-India-Tokenization-Empirical</w:t>
       </w:r>
     </w:p>
     <w:p>
@@ -2443,7 +3634,7 @@
           <w:sz w:val="18"/>
           <w:szCs w:val="18"/>
         </w:rPr>
-        <w:t xml:space="preserve">Xia, Y., et al. (2025). Exploration on Real World Assets and Tokenization. arXiv:2503.01111.</w:t>
+        <w:t xml:space="preserve">Securities and Exchange Board of India, 2025. SEBI (Infrastructure Investment Trusts) (Third Amendment) Regulations, 2025. Gazette of India, 2 September 2025. https://www.sebi.gov.in/sebi_data/attachdocs/sep-2025/1757046936652.pdf</w:t>
       </w:r>
     </w:p>
     <w:p>
@@ -2457,7 +3648,7 @@
           <w:sz w:val="18"/>
           <w:szCs w:val="18"/>
         </w:rPr>
-        <w:t xml:space="preserve">Anonymous. (2025). Tokenize Everything, But Can You Sell It? On the Liquidity of Real-World Asset Tokens. arXiv:2508.11651.</w:t>
+        <w:t xml:space="preserve">Shah, M. and Bhagwat, K., 2022. Critical assessment of Infrastructure Investment Trusts (InvITs) in India and suggesting measures to increase their efficiency in comparison with international instruments. Australasian Accounting, Business and Finance Journal, 16(5), pp.106–129. https://doi.org/10.14453/aabfj.v16i5.08</w:t>
       </w:r>
     </w:p>
     <w:p>
@@ -2471,7 +3662,35 @@
           <w:sz w:val="18"/>
           <w:szCs w:val="18"/>
         </w:rPr>
-        <w:t xml:space="preserve">Yescombe, E. R. (2017). Public-Private Partnerships in Infrastructure: Principles of Policy and Finance (2nd ed.). Butterworth-Heinemann.</w:t>
+        <w:t xml:space="preserve">Tian, Y., Lu, Z., Adriaens, P., Minchin, R.E., Caithness, A. and Woo, J., 2020. Finance infrastructure through blockchain-based tokenization. Frontiers of Engineering Management, 7(4), pp.485–499. https://doi.org/10.1007/s42524-020-0140-2</w:t>
+      </w:r>
+    </w:p>
+    <w:p>
+      <w:pPr>
+        <w:spacing w:after="80"/>
+        <w:ind w:left="360" w:hanging="360"/>
+      </w:pPr>
+      <w:r>
+        <w:rPr>
+          <w:rFonts w:ascii="Times New Roman" w:cs="Times New Roman" w:eastAsia="Times New Roman" w:hAnsi="Times New Roman"/>
+          <w:sz w:val="18"/>
+          <w:szCs w:val="18"/>
+        </w:rPr>
+        <w:t xml:space="preserve">Zhang, Y., Gong, B. and Zhou, P., 2024. Centralized use of decentralized technology: tokenization of currencies and assets. Structural Change and Economic Dynamics, 71, pp.15–25. https://doi.org/10.1016/j.strueco.2024.06.006</w:t>
+      </w:r>
+    </w:p>
+    <w:p>
+      <w:pPr>
+        <w:spacing w:after="80"/>
+        <w:ind w:left="360" w:hanging="360"/>
+      </w:pPr>
+      <w:r>
+        <w:rPr>
+          <w:rFonts w:ascii="Times New Roman" w:cs="Times New Roman" w:eastAsia="Times New Roman" w:hAnsi="Times New Roman"/>
+          <w:sz w:val="18"/>
+          <w:szCs w:val="18"/>
+        </w:rPr>
+        <w:t xml:space="preserve">Yescombe, E.R., 2017. Public-Private Partnerships in Infrastructure: Principles of Policy and Finance. 2nd ed. Oxford: Butterworth-Heinemann.</w:t>
       </w:r>
     </w:p>
     <w:sectPr>

</xml_diff>